<commit_message>
Update approach document to v1.1 to match the implementation
Pandas 3.x, CSV-only output (Parquet/Delta listed as extension), conflict
policy fixed to quarantine, file_sha256 in clean columns, txn_date window
rule, actual config and test names, assumptions numbering restarted at 1.
</commit_message>
<xml_diff>
--- a/docs/Approach_Document_Transaction_DQ_Pipeline.docx
+++ b/docs/Approach_Document_Transaction_DQ_Pipeline.docx
@@ -149,7 +149,7 @@
               <w:rPr>
                 <w:sz w:val="18"/>
               </w:rPr>
-              <w:t>Solution approach and design (pre-implementation)</w:t>
+              <w:t>Solution approach and design (updated to match the implementation)</w:t>
             </w:r>
           </w:p>
         </w:tc>
@@ -196,7 +196,7 @@
               <w:rPr>
                 <w:sz w:val="18"/>
               </w:rPr>
-              <w:t>1.0</w:t>
+              <w:t>1.1</w:t>
             </w:r>
           </w:p>
         </w:tc>
@@ -274,6 +274,104 @@
                 <w:b/>
                 <w:sz w:val="18"/>
               </w:rPr>
+              <w:t>Status</w:t>
+            </w:r>
+          </w:p>
+        </w:tc>
+        <w:tc>
+          <w:tcPr>
+            <w:tcW w:w="6000" w:type="dxa"/>
+            <w:shd w:val="clear" w:color="auto" w:fill="F2F6FC"/>
+          </w:tcPr>
+          <w:p>
+            <w:pPr>
+              <w:spacing w:after="0"/>
+              <w:rPr>
+                <w:sz w:val="18"/>
+              </w:rPr>
+            </w:pPr>
+            <w:r>
+              <w:rPr>
+                <w:sz w:val="18"/>
+              </w:rPr>
+              <w:t>Implemented: github.com/Madhav1301/fci-transaction-pipeline</w:t>
+            </w:r>
+          </w:p>
+        </w:tc>
+      </w:tr>
+      <w:tr>
+        <w:trPr>
+          <w:cantSplit/>
+        </w:trPr>
+        <w:tc>
+          <w:tcPr>
+            <w:tcW w:w="2600" w:type="dxa"/>
+            <w:tcBorders>
+              <w:bottom w:val="single" w:sz="4" w:space="0" w:color="BFBFBF"/>
+            </w:tcBorders>
+          </w:tcPr>
+          <w:p>
+            <w:pPr>
+              <w:spacing w:after="0"/>
+              <w:rPr>
+                <w:b/>
+                <w:sz w:val="18"/>
+              </w:rPr>
+            </w:pPr>
+            <w:r>
+              <w:rPr>
+                <w:b/>
+                <w:sz w:val="18"/>
+              </w:rPr>
+              <w:t>Inputs analysed</w:t>
+            </w:r>
+          </w:p>
+        </w:tc>
+        <w:tc>
+          <w:tcPr>
+            <w:tcW w:w="6000" w:type="dxa"/>
+            <w:tcBorders>
+              <w:bottom w:val="single" w:sz="4" w:space="0" w:color="BFBFBF"/>
+            </w:tcBorders>
+          </w:tcPr>
+          <w:p>
+            <w:pPr>
+              <w:spacing w:after="0"/>
+              <w:rPr>
+                <w:sz w:val="18"/>
+              </w:rPr>
+            </w:pPr>
+            <w:r>
+              <w:rPr>
+                <w:sz w:val="18"/>
+              </w:rPr>
+              <w:t>batch_2026-08-01.csv, batch_2026-08-04_late_correction.csv, NOTES.txt</w:t>
+            </w:r>
+          </w:p>
+        </w:tc>
+      </w:tr>
+      <w:tr>
+        <w:trPr>
+          <w:cantSplit/>
+        </w:trPr>
+        <w:tc>
+          <w:tcPr>
+            <w:tcW w:w="2600" w:type="dxa"/>
+            <w:shd w:val="clear" w:color="auto" w:fill="F2F6FC"/>
+          </w:tcPr>
+          <w:p>
+            <w:pPr>
+              <w:spacing w:after="0"/>
+              <w:rPr>
+                <w:b/>
+                <w:sz w:val="18"/>
+              </w:rPr>
+            </w:pPr>
+            <w:r>
+              <w:rPr>
+                <w:b/>
+                <w:sz w:val="18"/>
+              </w:rPr>
               <w:t>Technology</w:t>
             </w:r>
           </w:p>
@@ -377,7 +475,7 @@
         <w:rPr>
           <w:noProof/>
         </w:rPr>
-        <w:instrText xml:space="preserve"> PAGEREF _Toc242538872 \h </w:instrText>
+        <w:instrText xml:space="preserve"> PAGEREF _Toc242541973 \h </w:instrText>
       </w:r>
       <w:r>
         <w:rPr>
@@ -435,7 +533,7 @@
         <w:rPr>
           <w:noProof/>
         </w:rPr>
-        <w:instrText xml:space="preserve"> PAGEREF _Toc242538873 \h </w:instrText>
+        <w:instrText xml:space="preserve"> PAGEREF _Toc242541974 \h </w:instrText>
       </w:r>
       <w:r>
         <w:rPr>
@@ -493,7 +591,7 @@
         <w:rPr>
           <w:noProof/>
         </w:rPr>
-        <w:instrText xml:space="preserve"> PAGEREF _Toc242538874 \h </w:instrText>
+        <w:instrText xml:space="preserve"> PAGEREF _Toc242541975 \h </w:instrText>
       </w:r>
       <w:r>
         <w:rPr>
@@ -551,7 +649,7 @@
         <w:rPr>
           <w:noProof/>
         </w:rPr>
-        <w:instrText xml:space="preserve"> PAGEREF _Toc242538875 \h </w:instrText>
+        <w:instrText xml:space="preserve"> PAGEREF _Toc242541976 \h </w:instrText>
       </w:r>
       <w:r>
         <w:rPr>
@@ -609,7 +707,7 @@
         <w:rPr>
           <w:noProof/>
         </w:rPr>
-        <w:instrText xml:space="preserve"> PAGEREF _Toc242538876 \h </w:instrText>
+        <w:instrText xml:space="preserve"> PAGEREF _Toc242541977 \h </w:instrText>
       </w:r>
       <w:r>
         <w:rPr>
@@ -667,7 +765,7 @@
         <w:rPr>
           <w:noProof/>
         </w:rPr>
-        <w:instrText xml:space="preserve"> PAGEREF _Toc242538877 \h </w:instrText>
+        <w:instrText xml:space="preserve"> PAGEREF _Toc242541978 \h </w:instrText>
       </w:r>
       <w:r>
         <w:rPr>
@@ -725,7 +823,7 @@
         <w:rPr>
           <w:noProof/>
         </w:rPr>
-        <w:instrText xml:space="preserve"> PAGEREF _Toc242538878 \h </w:instrText>
+        <w:instrText xml:space="preserve"> PAGEREF _Toc242541979 \h </w:instrText>
       </w:r>
       <w:r>
         <w:rPr>
@@ -783,7 +881,7 @@
         <w:rPr>
           <w:noProof/>
         </w:rPr>
-        <w:instrText xml:space="preserve"> PAGEREF _Toc242538879 \h </w:instrText>
+        <w:instrText xml:space="preserve"> PAGEREF _Toc242541980 \h </w:instrText>
       </w:r>
       <w:r>
         <w:rPr>
@@ -841,7 +939,7 @@
         <w:rPr>
           <w:noProof/>
         </w:rPr>
-        <w:instrText xml:space="preserve"> PAGEREF _Toc242538880 \h </w:instrText>
+        <w:instrText xml:space="preserve"> PAGEREF _Toc242541981 \h </w:instrText>
       </w:r>
       <w:r>
         <w:rPr>
@@ -899,7 +997,7 @@
         <w:rPr>
           <w:noProof/>
         </w:rPr>
-        <w:instrText xml:space="preserve"> PAGEREF _Toc242538881 \h </w:instrText>
+        <w:instrText xml:space="preserve"> PAGEREF _Toc242541982 \h </w:instrText>
       </w:r>
       <w:r>
         <w:rPr>
@@ -957,7 +1055,7 @@
         <w:rPr>
           <w:noProof/>
         </w:rPr>
-        <w:instrText xml:space="preserve"> PAGEREF _Toc242538882 \h </w:instrText>
+        <w:instrText xml:space="preserve"> PAGEREF _Toc242541983 \h </w:instrText>
       </w:r>
       <w:r>
         <w:rPr>
@@ -1015,7 +1113,7 @@
         <w:rPr>
           <w:noProof/>
         </w:rPr>
-        <w:instrText xml:space="preserve"> PAGEREF _Toc242538883 \h </w:instrText>
+        <w:instrText xml:space="preserve"> PAGEREF _Toc242541984 \h </w:instrText>
       </w:r>
       <w:r>
         <w:rPr>
@@ -1073,7 +1171,7 @@
         <w:rPr>
           <w:noProof/>
         </w:rPr>
-        <w:instrText xml:space="preserve"> PAGEREF _Toc242538884 \h </w:instrText>
+        <w:instrText xml:space="preserve"> PAGEREF _Toc242541985 \h </w:instrText>
       </w:r>
       <w:r>
         <w:rPr>
@@ -1131,7 +1229,7 @@
         <w:rPr>
           <w:noProof/>
         </w:rPr>
-        <w:instrText xml:space="preserve"> PAGEREF _Toc242538885 \h </w:instrText>
+        <w:instrText xml:space="preserve"> PAGEREF _Toc242541986 \h </w:instrText>
       </w:r>
       <w:r>
         <w:rPr>
@@ -1189,7 +1287,7 @@
         <w:rPr>
           <w:noProof/>
         </w:rPr>
-        <w:instrText xml:space="preserve"> PAGEREF _Toc242538886 \h </w:instrText>
+        <w:instrText xml:space="preserve"> PAGEREF _Toc242541987 \h </w:instrText>
       </w:r>
       <w:r>
         <w:rPr>
@@ -1247,7 +1345,7 @@
         <w:rPr>
           <w:noProof/>
         </w:rPr>
-        <w:instrText xml:space="preserve"> PAGEREF _Toc242538887 \h </w:instrText>
+        <w:instrText xml:space="preserve"> PAGEREF _Toc242541988 \h </w:instrText>
       </w:r>
       <w:r>
         <w:rPr>
@@ -1305,7 +1403,7 @@
         <w:rPr>
           <w:noProof/>
         </w:rPr>
-        <w:instrText xml:space="preserve"> PAGEREF _Toc242538888 \h </w:instrText>
+        <w:instrText xml:space="preserve"> PAGEREF _Toc242541989 \h </w:instrText>
       </w:r>
       <w:r>
         <w:rPr>
@@ -1363,7 +1461,7 @@
         <w:rPr>
           <w:noProof/>
         </w:rPr>
-        <w:instrText xml:space="preserve"> PAGEREF _Toc242538889 \h </w:instrText>
+        <w:instrText xml:space="preserve"> PAGEREF _Toc242541990 \h </w:instrText>
       </w:r>
       <w:r>
         <w:rPr>
@@ -1421,7 +1519,7 @@
         <w:rPr>
           <w:noProof/>
         </w:rPr>
-        <w:instrText xml:space="preserve"> PAGEREF _Toc242538890 \h </w:instrText>
+        <w:instrText xml:space="preserve"> PAGEREF _Toc242541991 \h </w:instrText>
       </w:r>
       <w:r>
         <w:rPr>
@@ -1479,7 +1577,7 @@
         <w:rPr>
           <w:noProof/>
         </w:rPr>
-        <w:instrText xml:space="preserve"> PAGEREF _Toc242538891 \h </w:instrText>
+        <w:instrText xml:space="preserve"> PAGEREF _Toc242541992 \h </w:instrText>
       </w:r>
       <w:r>
         <w:rPr>
@@ -1537,7 +1635,7 @@
         <w:rPr>
           <w:noProof/>
         </w:rPr>
-        <w:instrText xml:space="preserve"> PAGEREF _Toc242538892 \h </w:instrText>
+        <w:instrText xml:space="preserve"> PAGEREF _Toc242541993 \h </w:instrText>
       </w:r>
       <w:r>
         <w:rPr>
@@ -1595,7 +1693,7 @@
         <w:rPr>
           <w:noProof/>
         </w:rPr>
-        <w:instrText xml:space="preserve"> PAGEREF _Toc242538893 \h </w:instrText>
+        <w:instrText xml:space="preserve"> PAGEREF _Toc242541994 \h </w:instrText>
       </w:r>
       <w:r>
         <w:rPr>
@@ -1653,7 +1751,7 @@
         <w:rPr>
           <w:noProof/>
         </w:rPr>
-        <w:instrText xml:space="preserve"> PAGEREF _Toc242538894 \h </w:instrText>
+        <w:instrText xml:space="preserve"> PAGEREF _Toc242541995 \h </w:instrText>
       </w:r>
       <w:r>
         <w:rPr>
@@ -1711,7 +1809,7 @@
         <w:rPr>
           <w:noProof/>
         </w:rPr>
-        <w:instrText xml:space="preserve"> PAGEREF _Toc242538895 \h </w:instrText>
+        <w:instrText xml:space="preserve"> PAGEREF _Toc242541996 \h </w:instrText>
       </w:r>
       <w:r>
         <w:rPr>
@@ -1769,7 +1867,7 @@
         <w:rPr>
           <w:noProof/>
         </w:rPr>
-        <w:instrText xml:space="preserve"> PAGEREF _Toc242538896 \h </w:instrText>
+        <w:instrText xml:space="preserve"> PAGEREF _Toc242541997 \h </w:instrText>
       </w:r>
       <w:r>
         <w:rPr>
@@ -1827,7 +1925,7 @@
         <w:rPr>
           <w:noProof/>
         </w:rPr>
-        <w:instrText xml:space="preserve"> PAGEREF _Toc242538897 \h </w:instrText>
+        <w:instrText xml:space="preserve"> PAGEREF _Toc242541998 \h </w:instrText>
       </w:r>
       <w:r>
         <w:rPr>
@@ -1885,7 +1983,7 @@
         <w:rPr>
           <w:noProof/>
         </w:rPr>
-        <w:instrText xml:space="preserve"> PAGEREF _Toc242538898 \h </w:instrText>
+        <w:instrText xml:space="preserve"> PAGEREF _Toc242541999 \h </w:instrText>
       </w:r>
       <w:r>
         <w:rPr>
@@ -1943,7 +2041,7 @@
         <w:rPr>
           <w:noProof/>
         </w:rPr>
-        <w:instrText xml:space="preserve"> PAGEREF _Toc242538899 \h </w:instrText>
+        <w:instrText xml:space="preserve"> PAGEREF _Toc242542000 \h </w:instrText>
       </w:r>
       <w:r>
         <w:rPr>
@@ -2001,7 +2099,7 @@
         <w:rPr>
           <w:noProof/>
         </w:rPr>
-        <w:instrText xml:space="preserve"> PAGEREF _Toc242538900 \h </w:instrText>
+        <w:instrText xml:space="preserve"> PAGEREF _Toc242542001 \h </w:instrText>
       </w:r>
       <w:r>
         <w:rPr>
@@ -2059,7 +2157,7 @@
         <w:rPr>
           <w:noProof/>
         </w:rPr>
-        <w:instrText xml:space="preserve"> PAGEREF _Toc242538901 \h </w:instrText>
+        <w:instrText xml:space="preserve"> PAGEREF _Toc242542002 \h </w:instrText>
       </w:r>
       <w:r>
         <w:rPr>
@@ -2117,7 +2215,7 @@
         <w:rPr>
           <w:noProof/>
         </w:rPr>
-        <w:instrText xml:space="preserve"> PAGEREF _Toc242538902 \h </w:instrText>
+        <w:instrText xml:space="preserve"> PAGEREF _Toc242542003 \h </w:instrText>
       </w:r>
       <w:r>
         <w:rPr>
@@ -2175,7 +2273,7 @@
         <w:rPr>
           <w:noProof/>
         </w:rPr>
-        <w:instrText xml:space="preserve"> PAGEREF _Toc242538903 \h </w:instrText>
+        <w:instrText xml:space="preserve"> PAGEREF _Toc242542004 \h </w:instrText>
       </w:r>
       <w:r>
         <w:rPr>
@@ -2192,7 +2290,7 @@
         <w:rPr>
           <w:noProof/>
         </w:rPr>
-        <w:t>12</w:t>
+        <w:t>13</w:t>
       </w:r>
       <w:r>
         <w:rPr>
@@ -2233,7 +2331,7 @@
         <w:rPr>
           <w:noProof/>
         </w:rPr>
-        <w:instrText xml:space="preserve"> PAGEREF _Toc242538904 \h </w:instrText>
+        <w:instrText xml:space="preserve"> PAGEREF _Toc242542005 \h </w:instrText>
       </w:r>
       <w:r>
         <w:rPr>
@@ -2290,7 +2388,7 @@
       <w:pPr>
         <w:pStyle w:val="Heading1"/>
       </w:pPr>
-      <w:bookmarkStart w:id="0" w:name="_Toc242538872"/>
+      <w:bookmarkStart w:id="0" w:name="_Toc242541973"/>
       <w:r>
         <w:lastRenderedPageBreak/>
         <w:t>1. Introduction</w:t>
@@ -2301,7 +2399,7 @@
       <w:pPr>
         <w:pStyle w:val="Heading2"/>
       </w:pPr>
-      <w:bookmarkStart w:id="1" w:name="_Toc242538873"/>
+      <w:bookmarkStart w:id="1" w:name="_Toc242541974"/>
       <w:r>
         <w:t>1.1 Purpose</w:t>
       </w:r>
@@ -2309,14 +2407,14 @@
     </w:p>
     <w:p>
       <w:r>
-        <w:t>This document describes the proposed approach for a Python-based batch pipeline that ingests daily bank-transaction files, removes duplicates, quarantines invalid records, is safe to re-run, correctly applies late-arriving corrections and produces a reconciliation summary. It is written before implementation so that the design, components and assumptions can be reviewed and agreed first.</w:t>
+        <w:t>This document describes the proposed approach for a Python-based batch pipeline that ingests daily bank-transaction files, removes duplicates, quarantines invalid records, is safe to re-run, correctly applies late-arriving corrections and produces a reconciliation summary. It was written before implementation and has been updated to reflect what was built.</w:t>
       </w:r>
     </w:p>
     <w:p>
       <w:pPr>
         <w:pStyle w:val="Heading2"/>
       </w:pPr>
-      <w:bookmarkStart w:id="2" w:name="_Toc242538874"/>
+      <w:bookmarkStart w:id="2" w:name="_Toc242541975"/>
       <w:r>
         <w:t>1.2 Scope</w:t>
       </w:r>
@@ -2371,10 +2469,34 @@
       </w:r>
     </w:p>
     <w:p>
+      <w:r>
+        <w:rPr>
+          <w:b/>
+        </w:rPr>
+        <w:t>Out of scope</w:t>
+      </w:r>
+    </w:p>
+    <w:p>
+      <w:pPr>
+        <w:pStyle w:val="ListBullet"/>
+      </w:pPr>
+      <w:r>
+        <w:t>Real-time / streaming ingestion, database loading and scheduling/orchestration</w:t>
+      </w:r>
+    </w:p>
+    <w:p>
+      <w:pPr>
+        <w:pStyle w:val="ListBullet"/>
+      </w:pPr>
+      <w:r>
+        <w:t>Recomputing account balances, or replaying quarantined records after manual repair</w:t>
+      </w:r>
+    </w:p>
+    <w:p>
       <w:pPr>
         <w:pStyle w:val="Heading2"/>
       </w:pPr>
-      <w:bookmarkStart w:id="3" w:name="_Toc242538875"/>
+      <w:bookmarkStart w:id="3" w:name="_Toc242541976"/>
       <w:r>
         <w:t>1.3 Requirement Traceability</w:t>
       </w:r>
@@ -3128,7 +3250,7 @@
       <w:pPr>
         <w:pStyle w:val="Heading1"/>
       </w:pPr>
-      <w:bookmarkStart w:id="4" w:name="_Toc242538876"/>
+      <w:bookmarkStart w:id="4" w:name="_Toc242541977"/>
       <w:r>
         <w:t>2. Source Data Analysis</w:t>
       </w:r>
@@ -3143,7 +3265,7 @@
       <w:pPr>
         <w:pStyle w:val="Heading2"/>
       </w:pPr>
-      <w:bookmarkStart w:id="5" w:name="_Toc242538877"/>
+      <w:bookmarkStart w:id="5" w:name="_Toc242541978"/>
       <w:r>
         <w:t>2.1 Files Received</w:t>
       </w:r>
@@ -3638,8 +3760,9 @@
       <w:pPr>
         <w:pStyle w:val="Heading2"/>
       </w:pPr>
-      <w:bookmarkStart w:id="6" w:name="_Toc242538878"/>
-      <w:r>
+      <w:bookmarkStart w:id="6" w:name="_Toc242541979"/>
+      <w:r>
+        <w:lastRenderedPageBreak/>
         <w:t>2.2 Source Schema</w:t>
       </w:r>
       <w:bookmarkEnd w:id="6"/>
@@ -3972,7 +4095,6 @@
               <w:rPr>
                 <w:sz w:val="18"/>
               </w:rPr>
-              <w:lastRenderedPageBreak/>
               <w:t>txn_time</w:t>
             </w:r>
           </w:p>
@@ -4571,7 +4693,7 @@
       <w:pPr>
         <w:pStyle w:val="Heading2"/>
       </w:pPr>
-      <w:bookmarkStart w:id="7" w:name="_Toc242538879"/>
+      <w:bookmarkStart w:id="7" w:name="_Toc242541980"/>
       <w:r>
         <w:t>2.3 Profiling Findings</w:t>
       </w:r>
@@ -5859,7 +5981,7 @@
       <w:pPr>
         <w:pStyle w:val="Heading1"/>
       </w:pPr>
-      <w:bookmarkStart w:id="8" w:name="_Toc242538880"/>
+      <w:bookmarkStart w:id="8" w:name="_Toc242541981"/>
       <w:r>
         <w:t>3. Solution Architecture</w:t>
       </w:r>
@@ -5869,7 +5991,7 @@
       <w:pPr>
         <w:pStyle w:val="Heading2"/>
       </w:pPr>
-      <w:bookmarkStart w:id="9" w:name="_Toc242538881"/>
+      <w:bookmarkStart w:id="9" w:name="_Toc242541982"/>
       <w:r>
         <w:t>3.1 Overview</w:t>
       </w:r>
@@ -5882,6 +6004,7 @@
     </w:p>
     <w:p>
       <w:r>
+        <w:lastRenderedPageBreak/>
         <w:t>Every input row ends in exactly one of three places: the clean dataset, the quarantine file, or the duplicates audit file. This is what makes the reconciliation equation hold. The architecture diagram (Figure 1, section 3.4) shows the stages and data stores described below.</w:t>
       </w:r>
     </w:p>
@@ -5889,9 +6012,8 @@
       <w:pPr>
         <w:pStyle w:val="Heading2"/>
       </w:pPr>
-      <w:bookmarkStart w:id="10" w:name="_Toc242538882"/>
-      <w:r>
-        <w:lastRenderedPageBreak/>
+      <w:bookmarkStart w:id="10" w:name="_Toc242541983"/>
+      <w:r>
         <w:t>3.2 End-to-End Data Flow</w:t>
       </w:r>
       <w:bookmarkEnd w:id="10"/>
@@ -5984,7 +6106,7 @@
       <w:pPr>
         <w:pStyle w:val="Heading2"/>
       </w:pPr>
-      <w:bookmarkStart w:id="11" w:name="_Toc242538883"/>
+      <w:bookmarkStart w:id="11" w:name="_Toc242541984"/>
       <w:r>
         <w:t>3.3 Design Principles</w:t>
       </w:r>
@@ -6096,7 +6218,7 @@
       <w:pPr>
         <w:pStyle w:val="Heading2"/>
       </w:pPr>
-      <w:bookmarkStart w:id="12" w:name="_Toc242538884"/>
+      <w:bookmarkStart w:id="12" w:name="_Toc242541985"/>
       <w:r>
         <w:lastRenderedPageBreak/>
         <w:t>3.4 Architecture Diagram</w:t>
@@ -6112,10 +6234,10 @@
           <w:noProof/>
         </w:rPr>
         <w:drawing>
-          <wp:inline distT="0" distB="0" distL="0" distR="0" wp14:anchorId="771D2E99" wp14:editId="22668413">
+          <wp:inline distT="0" distB="0" distL="0" distR="0" wp14:anchorId="541C2535" wp14:editId="209A9DD6">
             <wp:extent cx="9207500" cy="4661569"/>
             <wp:effectExtent l="0" t="0" r="0" b="5715"/>
-            <wp:docPr id="1933376396" name="Picture 1"/>
+            <wp:docPr id="790935599" name="Picture 1"/>
             <wp:cNvGraphicFramePr>
               <a:graphicFrameLocks xmlns:a="http://schemas.openxmlformats.org/drawingml/2006/main" noChangeAspect="1"/>
             </wp:cNvGraphicFramePr>
@@ -6123,7 +6245,7 @@
               <a:graphicData uri="http://schemas.openxmlformats.org/drawingml/2006/picture">
                 <pic:pic xmlns:pic="http://schemas.openxmlformats.org/drawingml/2006/picture">
                   <pic:nvPicPr>
-                    <pic:cNvPr id="1933376396" name=""/>
+                    <pic:cNvPr id="790935599" name=""/>
                     <pic:cNvPicPr/>
                   </pic:nvPicPr>
                   <pic:blipFill>
@@ -6176,7 +6298,7 @@
       <w:pPr>
         <w:pStyle w:val="Heading1"/>
       </w:pPr>
-      <w:bookmarkStart w:id="13" w:name="_Toc242538885"/>
+      <w:bookmarkStart w:id="13" w:name="_Toc242541986"/>
       <w:r>
         <w:lastRenderedPageBreak/>
         <w:t>4. Components</w:t>
@@ -6544,7 +6666,7 @@
               <w:rPr>
                 <w:sz w:val="18"/>
               </w:rPr>
-              <w:t>ingest.py, state/manifest.json</w:t>
+              <w:t>ingest.py, manifest.py</w:t>
             </w:r>
           </w:p>
         </w:tc>
@@ -7314,7 +7436,7 @@
       <w:pPr>
         <w:pStyle w:val="Heading1"/>
       </w:pPr>
-      <w:bookmarkStart w:id="14" w:name="_Toc242538886"/>
+      <w:bookmarkStart w:id="14" w:name="_Toc242541987"/>
       <w:r>
         <w:t>5. Technology Stack</w:t>
       </w:r>
@@ -7538,7 +7660,7 @@
               <w:rPr>
                 <w:sz w:val="18"/>
               </w:rPr>
-              <w:t>Pandas 2.x</w:t>
+              <w:t>Pandas 3.x</w:t>
             </w:r>
           </w:p>
         </w:tc>
@@ -7749,7 +7871,7 @@
               <w:rPr>
                 <w:sz w:val="18"/>
               </w:rPr>
-              <w:t>CSV partitioned by txn_date (Parquet optional)</w:t>
+              <w:t>CSV partitioned by txn_date</w:t>
             </w:r>
           </w:p>
         </w:tc>
@@ -7771,7 +7893,7 @@
               <w:rPr>
                 <w:sz w:val="18"/>
               </w:rPr>
-              <w:t>Easy for reviewers to open; Parquet can be enabled in config</w:t>
+              <w:t>Easy for reviewers to open and diff; Parquet / Delta Lake is a listed extension</w:t>
             </w:r>
           </w:p>
         </w:tc>
@@ -8052,7 +8174,7 @@
       <w:pPr>
         <w:pStyle w:val="Heading2"/>
       </w:pPr>
-      <w:bookmarkStart w:id="15" w:name="_Toc242538887"/>
+      <w:bookmarkStart w:id="15" w:name="_Toc242541988"/>
       <w:r>
         <w:lastRenderedPageBreak/>
         <w:t>5.1 Why Pandas rather than PySpark</w:t>
@@ -8068,7 +8190,7 @@
       <w:pPr>
         <w:pStyle w:val="Heading1"/>
       </w:pPr>
-      <w:bookmarkStart w:id="16" w:name="_Toc242538888"/>
+      <w:bookmarkStart w:id="16" w:name="_Toc242541989"/>
       <w:r>
         <w:t>6. Processing Logic</w:t>
       </w:r>
@@ -8078,7 +8200,7 @@
       <w:pPr>
         <w:pStyle w:val="Heading2"/>
       </w:pPr>
-      <w:bookmarkStart w:id="17" w:name="_Toc242538889"/>
+      <w:bookmarkStart w:id="17" w:name="_Toc242541990"/>
       <w:r>
         <w:t>6.1 Ingestion and File Registration</w:t>
       </w:r>
@@ -8136,7 +8258,7 @@
       <w:pPr>
         <w:pStyle w:val="Heading2"/>
       </w:pPr>
-      <w:bookmarkStart w:id="18" w:name="_Toc242538890"/>
+      <w:bookmarkStart w:id="18" w:name="_Toc242541991"/>
       <w:r>
         <w:t>6.2 Standardisation</w:t>
       </w:r>
@@ -8194,7 +8316,7 @@
       <w:pPr>
         <w:pStyle w:val="Heading2"/>
       </w:pPr>
-      <w:bookmarkStart w:id="19" w:name="_Toc242538891"/>
+      <w:bookmarkStart w:id="19" w:name="_Toc242541992"/>
       <w:r>
         <w:t>6.3 Validation Rules</w:t>
       </w:r>
@@ -8622,7 +8744,7 @@
               <w:rPr>
                 <w:sz w:val="18"/>
               </w:rPr>
-              <w:t>txn_date in the future, or more than the configured days before the file date</w:t>
+              <w:t>txn_date after the date of the file that delivered it, or more than max_backdate_days before it</w:t>
             </w:r>
           </w:p>
         </w:tc>
@@ -9593,6 +9715,7 @@
               <w:rPr>
                 <w:sz w:val="18"/>
               </w:rPr>
+              <w:lastRenderedPageBreak/>
               <w:t>W03</w:t>
             </w:r>
           </w:p>
@@ -9687,7 +9810,6 @@
         <w:rPr>
           <w:b/>
         </w:rPr>
-        <w:lastRenderedPageBreak/>
         <w:t>Why a missing ref_no is a hard rule:</w:t>
       </w:r>
       <w:r>
@@ -9709,7 +9831,7 @@
       <w:pPr>
         <w:pStyle w:val="Heading2"/>
       </w:pPr>
-      <w:bookmarkStart w:id="20" w:name="_Toc242538892"/>
+      <w:bookmarkStart w:id="20" w:name="_Toc242541993"/>
       <w:r>
         <w:t>6.4 Duplicate Handling</w:t>
       </w:r>
@@ -10128,7 +10250,7 @@
       <w:pPr>
         <w:pStyle w:val="Heading2"/>
       </w:pPr>
-      <w:bookmarkStart w:id="21" w:name="_Toc242538893"/>
+      <w:bookmarkStart w:id="21" w:name="_Toc242541994"/>
       <w:r>
         <w:t>6.5 Re-processing and Idempotency</w:t>
       </w:r>
@@ -10500,7 +10622,7 @@
       <w:pPr>
         <w:pStyle w:val="Heading2"/>
       </w:pPr>
-      <w:bookmarkStart w:id="22" w:name="_Toc242538894"/>
+      <w:bookmarkStart w:id="22" w:name="_Toc242541995"/>
       <w:r>
         <w:t>6.6 Late Correction Handling</w:t>
       </w:r>
@@ -10542,6 +10664,7 @@
         <w:rPr>
           <w:b/>
         </w:rPr>
+        <w:lastRenderedPageBreak/>
         <w:t>De-duplication against history:</w:t>
       </w:r>
       <w:r>
@@ -10570,7 +10693,6 @@
         <w:rPr>
           <w:b/>
         </w:rPr>
-        <w:lastRenderedPageBreak/>
         <w:t>Balances:</w:t>
       </w:r>
       <w:r>
@@ -10617,7 +10739,7 @@
       <w:pPr>
         <w:pStyle w:val="Heading2"/>
       </w:pPr>
-      <w:bookmarkStart w:id="23" w:name="_Toc242538895"/>
+      <w:bookmarkStart w:id="23" w:name="_Toc242541996"/>
       <w:r>
         <w:t>6.7 Missing File Detection</w:t>
       </w:r>
@@ -10632,7 +10754,7 @@
       <w:pPr>
         <w:pStyle w:val="Heading1"/>
       </w:pPr>
-      <w:bookmarkStart w:id="24" w:name="_Toc242538896"/>
+      <w:bookmarkStart w:id="24" w:name="_Toc242541997"/>
       <w:r>
         <w:t>7. Output Datasets</w:t>
       </w:r>
@@ -11237,14 +11359,14 @@
         <w:t>Clean dataset columns:</w:t>
       </w:r>
       <w:r>
-        <w:t xml:space="preserve"> account_number, txn_date, txn_time, description, ref_no, debit, credit, balance, account_type, source_file, source_row_number, file_date, is_late_arrival, dq_warnings.</w:t>
+        <w:t xml:space="preserve"> account_number, txn_date, txn_time, description, ref_no, debit, credit, balance, account_type, source_file, source_row_number, file_date, file_sha256, is_late_arrival, dq_warnings.</w:t>
       </w:r>
     </w:p>
     <w:p>
       <w:pPr>
         <w:pStyle w:val="Heading1"/>
       </w:pPr>
-      <w:bookmarkStart w:id="25" w:name="_Toc242538897"/>
+      <w:bookmarkStart w:id="25" w:name="_Toc242541998"/>
       <w:r>
         <w:t>8. Reconciliation Summary</w:t>
       </w:r>
@@ -11759,6 +11881,7 @@
         <w:spacing w:before="160"/>
       </w:pPr>
       <w:r>
+        <w:lastRenderedPageBreak/>
         <w:t>Rejection reasons: MISSING_REF_NO 1, BOTH_DEBIT_AND_CREDIT 1, NO_DEBIT_OR_CREDIT 1</w:t>
       </w:r>
     </w:p>
@@ -11783,7 +11906,6 @@
         <w:pStyle w:val="ListBullet"/>
       </w:pPr>
       <w:r>
-        <w:lastRenderedPageBreak/>
         <w:t>Control check: 183 + 3 + 4 = 190</w:t>
       </w:r>
     </w:p>
@@ -11791,7 +11913,7 @@
       <w:pPr>
         <w:pStyle w:val="Heading1"/>
       </w:pPr>
-      <w:bookmarkStart w:id="26" w:name="_Toc242538898"/>
+      <w:bookmarkStart w:id="26" w:name="_Toc242541999"/>
       <w:r>
         <w:t>9. Configuration-Based Approach</w:t>
       </w:r>
@@ -11962,7 +12084,7 @@
                 <w:sz w:val="17"/>
               </w:rPr>
               <w:br/>
-              <w:t xml:space="preserve">  on_conflict: quarantine   # alternative: latest_wins</w:t>
+              <w:t xml:space="preserve">  on_conflict: quarantine   # same key, different values -&gt; review</w:t>
             </w:r>
             <w:r>
               <w:rPr>
@@ -11978,7 +12100,7 @@
                 <w:sz w:val="17"/>
               </w:rPr>
               <w:br/>
-              <w:t xml:space="preserve">  hard: [account_number_format, valid_txn_date, valid_txn_time, debit_credit_exclusive,</w:t>
+              <w:t xml:space="preserve">  hard: [account_number_format, valid_txn_date, txn_date_window, valid_txn_time,</w:t>
             </w:r>
             <w:r>
               <w:rPr>
@@ -11986,7 +12108,7 @@
                 <w:sz w:val="17"/>
               </w:rPr>
               <w:br/>
-              <w:t xml:space="preserve">         debit_credit_present, positive_amount, ref_no_present, valid_balance]</w:t>
+              <w:t xml:space="preserve">         debit_credit_exclusive, debit_credit_present, positive_amount,</w:t>
             </w:r>
             <w:r>
               <w:rPr>
@@ -11994,7 +12116,7 @@
                 <w:sz w:val="17"/>
               </w:rPr>
               <w:br/>
-              <w:t xml:space="preserve">  soft: [account_type_consistency, balance_continuity, negative_savings_balance]</w:t>
+              <w:t xml:space="preserve">         ref_no_present, valid_balance]</w:t>
             </w:r>
             <w:r>
               <w:rPr>
@@ -12002,7 +12124,7 @@
                 <w:sz w:val="17"/>
               </w:rPr>
               <w:br/>
-              <w:t xml:space="preserve">  max_backdate_days: 30</w:t>
+              <w:t xml:space="preserve">  soft: [account_type_consistency, balance_continuity, negative_savings_balance]</w:t>
             </w:r>
             <w:r>
               <w:rPr>
@@ -12010,7 +12132,7 @@
                 <w:sz w:val="17"/>
               </w:rPr>
               <w:br/>
-              <w:t>calendar:</w:t>
+              <w:t xml:space="preserve">  max_backdate_days: 30</w:t>
             </w:r>
             <w:r>
               <w:rPr>
@@ -12018,7 +12140,7 @@
                 <w:sz w:val="17"/>
               </w:rPr>
               <w:br/>
-              <w:t xml:space="preserve">  frequency: daily</w:t>
+              <w:t>calendar:</w:t>
             </w:r>
             <w:r>
               <w:rPr>
@@ -12026,7 +12148,7 @@
                 <w:sz w:val="17"/>
               </w:rPr>
               <w:br/>
-              <w:t xml:space="preserve">  start_date: 2026-08-01</w:t>
+              <w:t xml:space="preserve">  frequency: daily          # daily | business_days</w:t>
             </w:r>
             <w:r>
               <w:rPr>
@@ -12034,7 +12156,7 @@
                 <w:sz w:val="17"/>
               </w:rPr>
               <w:br/>
-              <w:t>output:</w:t>
+              <w:t xml:space="preserve">  start_date: 2026-08-01</w:t>
             </w:r>
             <w:r>
               <w:rPr>
@@ -12042,7 +12164,7 @@
                 <w:sz w:val="17"/>
               </w:rPr>
               <w:br/>
-              <w:t xml:space="preserve">  base_dir: output/</w:t>
+              <w:t xml:space="preserve">  expected_file_name: "batch_{date}.csv"</w:t>
             </w:r>
             <w:r>
               <w:rPr>
@@ -12050,7 +12172,7 @@
                 <w:sz w:val="17"/>
               </w:rPr>
               <w:br/>
-              <w:t xml:space="preserve">  format: csv               # or parquet</w:t>
+              <w:t>output:</w:t>
             </w:r>
             <w:r>
               <w:rPr>
@@ -12058,7 +12180,47 @@
                 <w:sz w:val="17"/>
               </w:rPr>
               <w:br/>
-              <w:t xml:space="preserve">  partition_by: txn_date</w:t>
+              <w:t xml:space="preserve">  clean_dir: output/clean   # partitioned by txn_date</w:t>
+            </w:r>
+            <w:r>
+              <w:rPr>
+                <w:rFonts w:ascii="Consolas" w:hAnsi="Consolas"/>
+                <w:sz w:val="17"/>
+              </w:rPr>
+              <w:br/>
+              <w:t xml:space="preserve">  quarantine_file: output/quarantine/quarantine.csv</w:t>
+            </w:r>
+            <w:r>
+              <w:rPr>
+                <w:rFonts w:ascii="Consolas" w:hAnsi="Consolas"/>
+                <w:sz w:val="17"/>
+              </w:rPr>
+              <w:br/>
+              <w:t xml:space="preserve">  duplicates_file: output/audit/duplicates_removed.csv</w:t>
+            </w:r>
+            <w:r>
+              <w:rPr>
+                <w:rFonts w:ascii="Consolas" w:hAnsi="Consolas"/>
+                <w:sz w:val="17"/>
+              </w:rPr>
+              <w:br/>
+              <w:t xml:space="preserve">  reports_dir: reports</w:t>
+            </w:r>
+            <w:r>
+              <w:rPr>
+                <w:rFonts w:ascii="Consolas" w:hAnsi="Consolas"/>
+                <w:sz w:val="17"/>
+              </w:rPr>
+              <w:br/>
+              <w:t xml:space="preserve">  manifest_file: state/manifest.json</w:t>
+            </w:r>
+            <w:r>
+              <w:rPr>
+                <w:rFonts w:ascii="Consolas" w:hAnsi="Consolas"/>
+                <w:sz w:val="17"/>
+              </w:rPr>
+              <w:br/>
+              <w:t xml:space="preserve">  log_file: logs/pipeline.log</w:t>
             </w:r>
           </w:p>
         </w:tc>
@@ -12068,7 +12230,7 @@
       <w:pPr>
         <w:pStyle w:val="Heading1"/>
       </w:pPr>
-      <w:bookmarkStart w:id="27" w:name="_Toc242538899"/>
+      <w:bookmarkStart w:id="27" w:name="_Toc242542000"/>
       <w:r>
         <w:t>10. Testing Strategy</w:t>
       </w:r>
@@ -12076,12 +12238,12 @@
     </w:p>
     <w:p>
       <w:r>
-        <w:t>Unit tests use small in-memory or temporary-folder datasets; an end-to-end test runs the real files and checks the figures in section 8.</w:t>
+        <w:t>The suite has 43 pytest tests. Unit tests use small in-memory or temporary-folder datasets, and every test runs against an isolated copy of the real configuration. An end-to-end test runs the provided files and checks the figures in section 8.</w:t>
       </w:r>
     </w:p>
     <w:tbl>
       <w:tblPr>
-        <w:tblW w:w="0" w:type="auto"/>
+        <w:tblW w:w="9620" w:type="dxa"/>
         <w:tblBorders>
           <w:top w:val="single" w:sz="4" w:space="0" w:color="BFBFBF"/>
           <w:left w:val="single" w:sz="4" w:space="0" w:color="BFBFBF"/>
@@ -12100,8 +12262,8 @@
         <w:tblLook w:val="0000" w:firstRow="0" w:lastRow="0" w:firstColumn="0" w:lastColumn="0" w:noHBand="0" w:noVBand="0"/>
       </w:tblPr>
       <w:tblGrid>
-        <w:gridCol w:w="3800"/>
-        <w:gridCol w:w="5820"/>
+        <w:gridCol w:w="5000"/>
+        <w:gridCol w:w="4620"/>
       </w:tblGrid>
       <w:tr>
         <w:trPr>
@@ -12110,7 +12272,7 @@
         </w:trPr>
         <w:tc>
           <w:tcPr>
-            <w:tcW w:w="3800" w:type="dxa"/>
+            <w:tcW w:w="5000" w:type="dxa"/>
             <w:shd w:val="clear" w:color="auto" w:fill="1F3864"/>
           </w:tcPr>
           <w:p>
@@ -12134,7 +12296,7 @@
         </w:tc>
         <w:tc>
           <w:tcPr>
-            <w:tcW w:w="5820" w:type="dxa"/>
+            <w:tcW w:w="4620" w:type="dxa"/>
             <w:shd w:val="clear" w:color="auto" w:fill="1F3864"/>
           </w:tcPr>
           <w:p>
@@ -12163,45 +12325,45 @@
         </w:trPr>
         <w:tc>
           <w:tcPr>
-            <w:tcW w:w="3800" w:type="dxa"/>
-            <w:tcBorders>
-              <w:bottom w:val="single" w:sz="4" w:space="0" w:color="BFBFBF"/>
-            </w:tcBorders>
-          </w:tcPr>
-          <w:p>
-            <w:pPr>
-              <w:spacing w:after="0"/>
-              <w:rPr>
-                <w:sz w:val="18"/>
-              </w:rPr>
-            </w:pPr>
-            <w:r>
-              <w:rPr>
-                <w:sz w:val="18"/>
-              </w:rPr>
-              <w:t>test_exact_duplicates_removed</w:t>
-            </w:r>
-          </w:p>
-        </w:tc>
-        <w:tc>
-          <w:tcPr>
-            <w:tcW w:w="5820" w:type="dxa"/>
-            <w:tcBorders>
-              <w:bottom w:val="single" w:sz="4" w:space="0" w:color="BFBFBF"/>
-            </w:tcBorders>
-          </w:tcPr>
-          <w:p>
-            <w:pPr>
-              <w:spacing w:after="0"/>
-              <w:rPr>
-                <w:sz w:val="18"/>
-              </w:rPr>
-            </w:pPr>
-            <w:r>
-              <w:rPr>
-                <w:sz w:val="18"/>
-              </w:rPr>
-              <w:t>Identical rows are removed and counted</w:t>
+            <w:tcW w:w="5000" w:type="dxa"/>
+            <w:tcBorders>
+              <w:bottom w:val="single" w:sz="4" w:space="0" w:color="BFBFBF"/>
+            </w:tcBorders>
+          </w:tcPr>
+          <w:p>
+            <w:pPr>
+              <w:spacing w:after="0"/>
+              <w:rPr>
+                <w:sz w:val="18"/>
+              </w:rPr>
+            </w:pPr>
+            <w:r>
+              <w:rPr>
+                <w:sz w:val="18"/>
+              </w:rPr>
+              <w:t>test_invalid_dates_are_rejected</w:t>
+            </w:r>
+          </w:p>
+        </w:tc>
+        <w:tc>
+          <w:tcPr>
+            <w:tcW w:w="4620" w:type="dxa"/>
+            <w:tcBorders>
+              <w:bottom w:val="single" w:sz="4" w:space="0" w:color="BFBFBF"/>
+            </w:tcBorders>
+          </w:tcPr>
+          <w:p>
+            <w:pPr>
+              <w:spacing w:after="0"/>
+              <w:rPr>
+                <w:sz w:val="18"/>
+              </w:rPr>
+            </w:pPr>
+            <w:r>
+              <w:rPr>
+                <w:sz w:val="18"/>
+              </w:rPr>
+              <w:t>31-02-2026, 32-08-2026, 2026/08/01, ISO format, blank, after the file date and too old are all rejected</w:t>
             </w:r>
           </w:p>
         </w:tc>
@@ -12212,41 +12374,41 @@
         </w:trPr>
         <w:tc>
           <w:tcPr>
-            <w:tcW w:w="3800" w:type="dxa"/>
-            <w:shd w:val="clear" w:color="auto" w:fill="F2F6FC"/>
-          </w:tcPr>
-          <w:p>
-            <w:pPr>
-              <w:spacing w:after="0"/>
-              <w:rPr>
-                <w:sz w:val="18"/>
-              </w:rPr>
-            </w:pPr>
-            <w:r>
-              <w:rPr>
-                <w:sz w:val="18"/>
-              </w:rPr>
-              <w:t>test_genuine_repeats_kept</w:t>
-            </w:r>
-          </w:p>
-        </w:tc>
-        <w:tc>
-          <w:tcPr>
-            <w:tcW w:w="5820" w:type="dxa"/>
-            <w:shd w:val="clear" w:color="auto" w:fill="F2F6FC"/>
-          </w:tcPr>
-          <w:p>
-            <w:pPr>
-              <w:spacing w:after="0"/>
-              <w:rPr>
-                <w:sz w:val="18"/>
-              </w:rPr>
-            </w:pPr>
-            <w:r>
-              <w:rPr>
-                <w:sz w:val="18"/>
-              </w:rPr>
-              <w:t>Same values with different ref_no are all kept</w:t>
+            <w:tcW w:w="5000" w:type="dxa"/>
+            <w:shd w:val="clear" w:color="auto" w:fill="F2F6FC"/>
+          </w:tcPr>
+          <w:p>
+            <w:pPr>
+              <w:spacing w:after="0"/>
+              <w:rPr>
+                <w:sz w:val="18"/>
+              </w:rPr>
+            </w:pPr>
+            <w:r>
+              <w:rPr>
+                <w:sz w:val="18"/>
+              </w:rPr>
+              <w:t>test_both_debit_and_credit / test_neither_debit_nor_credit</w:t>
+            </w:r>
+          </w:p>
+        </w:tc>
+        <w:tc>
+          <w:tcPr>
+            <w:tcW w:w="4620" w:type="dxa"/>
+            <w:shd w:val="clear" w:color="auto" w:fill="F2F6FC"/>
+          </w:tcPr>
+          <w:p>
+            <w:pPr>
+              <w:spacing w:after="0"/>
+              <w:rPr>
+                <w:sz w:val="18"/>
+              </w:rPr>
+            </w:pPr>
+            <w:r>
+              <w:rPr>
+                <w:sz w:val="18"/>
+              </w:rPr>
+              <w:t>Both-present and neither-present rows are rejected with the right reason</w:t>
             </w:r>
           </w:p>
         </w:tc>
@@ -12257,45 +12419,45 @@
         </w:trPr>
         <w:tc>
           <w:tcPr>
-            <w:tcW w:w="3800" w:type="dxa"/>
-            <w:tcBorders>
-              <w:bottom w:val="single" w:sz="4" w:space="0" w:color="BFBFBF"/>
-            </w:tcBorders>
-          </w:tcPr>
-          <w:p>
-            <w:pPr>
-              <w:spacing w:after="0"/>
-              <w:rPr>
-                <w:sz w:val="18"/>
-              </w:rPr>
-            </w:pPr>
-            <w:r>
-              <w:rPr>
-                <w:sz w:val="18"/>
-              </w:rPr>
-              <w:t>test_key_conflict_quarantined</w:t>
-            </w:r>
-          </w:p>
-        </w:tc>
-        <w:tc>
-          <w:tcPr>
-            <w:tcW w:w="5820" w:type="dxa"/>
-            <w:tcBorders>
-              <w:bottom w:val="single" w:sz="4" w:space="0" w:color="BFBFBF"/>
-            </w:tcBorders>
-          </w:tcPr>
-          <w:p>
-            <w:pPr>
-              <w:spacing w:after="0"/>
-              <w:rPr>
-                <w:sz w:val="18"/>
-              </w:rPr>
-            </w:pPr>
-            <w:r>
-              <w:rPr>
-                <w:sz w:val="18"/>
-              </w:rPr>
-              <w:t>Same key with different values is quarantined, not overwritten</w:t>
+            <w:tcW w:w="5000" w:type="dxa"/>
+            <w:tcBorders>
+              <w:bottom w:val="single" w:sz="4" w:space="0" w:color="BFBFBF"/>
+            </w:tcBorders>
+          </w:tcPr>
+          <w:p>
+            <w:pPr>
+              <w:spacing w:after="0"/>
+              <w:rPr>
+                <w:sz w:val="18"/>
+              </w:rPr>
+            </w:pPr>
+            <w:r>
+              <w:rPr>
+                <w:sz w:val="18"/>
+              </w:rPr>
+              <w:t>test_invalid_amounts / test_missing_ref_no / test_bad_account_number</w:t>
+            </w:r>
+          </w:p>
+        </w:tc>
+        <w:tc>
+          <w:tcPr>
+            <w:tcW w:w="4620" w:type="dxa"/>
+            <w:tcBorders>
+              <w:bottom w:val="single" w:sz="4" w:space="0" w:color="BFBFBF"/>
+            </w:tcBorders>
+          </w:tcPr>
+          <w:p>
+            <w:pPr>
+              <w:spacing w:after="0"/>
+              <w:rPr>
+                <w:sz w:val="18"/>
+              </w:rPr>
+            </w:pPr>
+            <w:r>
+              <w:rPr>
+                <w:sz w:val="18"/>
+              </w:rPr>
+              <w:t>Each hard rule rejects with its own reason code</w:t>
             </w:r>
           </w:p>
         </w:tc>
@@ -12306,41 +12468,41 @@
         </w:trPr>
         <w:tc>
           <w:tcPr>
-            <w:tcW w:w="3800" w:type="dxa"/>
-            <w:shd w:val="clear" w:color="auto" w:fill="F2F6FC"/>
-          </w:tcPr>
-          <w:p>
-            <w:pPr>
-              <w:spacing w:after="0"/>
-              <w:rPr>
-                <w:sz w:val="18"/>
-              </w:rPr>
-            </w:pPr>
-            <w:r>
-              <w:rPr>
-                <w:sz w:val="18"/>
-              </w:rPr>
-              <w:t>test_invalid_dates</w:t>
-            </w:r>
-          </w:p>
-        </w:tc>
-        <w:tc>
-          <w:tcPr>
-            <w:tcW w:w="5820" w:type="dxa"/>
-            <w:shd w:val="clear" w:color="auto" w:fill="F2F6FC"/>
-          </w:tcPr>
-          <w:p>
-            <w:pPr>
-              <w:spacing w:after="0"/>
-              <w:rPr>
-                <w:sz w:val="18"/>
-              </w:rPr>
-            </w:pPr>
-            <w:r>
-              <w:rPr>
-                <w:sz w:val="18"/>
-              </w:rPr>
-              <w:t>31-02-2026, 2026/08/01, blank and future dates are rejected</w:t>
+            <w:tcW w:w="5000" w:type="dxa"/>
+            <w:shd w:val="clear" w:color="auto" w:fill="F2F6FC"/>
+          </w:tcPr>
+          <w:p>
+            <w:pPr>
+              <w:spacing w:after="0"/>
+              <w:rPr>
+                <w:sz w:val="18"/>
+              </w:rPr>
+            </w:pPr>
+            <w:r>
+              <w:rPr>
+                <w:sz w:val="18"/>
+              </w:rPr>
+              <w:t>test_every_reason_is_reported</w:t>
+            </w:r>
+          </w:p>
+        </w:tc>
+        <w:tc>
+          <w:tcPr>
+            <w:tcW w:w="4620" w:type="dxa"/>
+            <w:shd w:val="clear" w:color="auto" w:fill="F2F6FC"/>
+          </w:tcPr>
+          <w:p>
+            <w:pPr>
+              <w:spacing w:after="0"/>
+              <w:rPr>
+                <w:sz w:val="18"/>
+              </w:rPr>
+            </w:pPr>
+            <w:r>
+              <w:rPr>
+                <w:sz w:val="18"/>
+              </w:rPr>
+              <w:t>A row failing several rules lists every reason</w:t>
             </w:r>
           </w:p>
         </w:tc>
@@ -12351,45 +12513,45 @@
         </w:trPr>
         <w:tc>
           <w:tcPr>
-            <w:tcW w:w="3800" w:type="dxa"/>
-            <w:tcBorders>
-              <w:bottom w:val="single" w:sz="4" w:space="0" w:color="BFBFBF"/>
-            </w:tcBorders>
-          </w:tcPr>
-          <w:p>
-            <w:pPr>
-              <w:spacing w:after="0"/>
-              <w:rPr>
-                <w:sz w:val="18"/>
-              </w:rPr>
-            </w:pPr>
-            <w:r>
-              <w:rPr>
-                <w:sz w:val="18"/>
-              </w:rPr>
-              <w:t>test_debit_credit_rules</w:t>
-            </w:r>
-          </w:p>
-        </w:tc>
-        <w:tc>
-          <w:tcPr>
-            <w:tcW w:w="5820" w:type="dxa"/>
-            <w:tcBorders>
-              <w:bottom w:val="single" w:sz="4" w:space="0" w:color="BFBFBF"/>
-            </w:tcBorders>
-          </w:tcPr>
-          <w:p>
-            <w:pPr>
-              <w:spacing w:after="0"/>
-              <w:rPr>
-                <w:sz w:val="18"/>
-              </w:rPr>
-            </w:pPr>
-            <w:r>
-              <w:rPr>
-                <w:sz w:val="18"/>
-              </w:rPr>
-              <w:t>Both-present and neither-present rows are rejected with the right reason</w:t>
+            <w:tcW w:w="5000" w:type="dxa"/>
+            <w:tcBorders>
+              <w:bottom w:val="single" w:sz="4" w:space="0" w:color="BFBFBF"/>
+            </w:tcBorders>
+          </w:tcPr>
+          <w:p>
+            <w:pPr>
+              <w:spacing w:after="0"/>
+              <w:rPr>
+                <w:sz w:val="18"/>
+              </w:rPr>
+            </w:pPr>
+            <w:r>
+              <w:rPr>
+                <w:sz w:val="18"/>
+              </w:rPr>
+              <w:t>test_soft_rules_flag_but_never_reject</w:t>
+            </w:r>
+          </w:p>
+        </w:tc>
+        <w:tc>
+          <w:tcPr>
+            <w:tcW w:w="4620" w:type="dxa"/>
+            <w:tcBorders>
+              <w:bottom w:val="single" w:sz="4" w:space="0" w:color="BFBFBF"/>
+            </w:tcBorders>
+          </w:tcPr>
+          <w:p>
+            <w:pPr>
+              <w:spacing w:after="0"/>
+              <w:rPr>
+                <w:sz w:val="18"/>
+              </w:rPr>
+            </w:pPr>
+            <w:r>
+              <w:rPr>
+                <w:sz w:val="18"/>
+              </w:rPr>
+              <w:t>Account type mismatch and balance discontinuity are warnings only</w:t>
             </w:r>
           </w:p>
         </w:tc>
@@ -12400,41 +12562,41 @@
         </w:trPr>
         <w:tc>
           <w:tcPr>
-            <w:tcW w:w="3800" w:type="dxa"/>
-            <w:shd w:val="clear" w:color="auto" w:fill="F2F6FC"/>
-          </w:tcPr>
-          <w:p>
-            <w:pPr>
-              <w:spacing w:after="0"/>
-              <w:rPr>
-                <w:sz w:val="18"/>
-              </w:rPr>
-            </w:pPr>
-            <w:r>
-              <w:rPr>
-                <w:sz w:val="18"/>
-              </w:rPr>
-              <w:t>test_missing_ref_no</w:t>
-            </w:r>
-          </w:p>
-        </w:tc>
-        <w:tc>
-          <w:tcPr>
-            <w:tcW w:w="5820" w:type="dxa"/>
-            <w:shd w:val="clear" w:color="auto" w:fill="F2F6FC"/>
-          </w:tcPr>
-          <w:p>
-            <w:pPr>
-              <w:spacing w:after="0"/>
-              <w:rPr>
-                <w:sz w:val="18"/>
-              </w:rPr>
-            </w:pPr>
-            <w:r>
-              <w:rPr>
-                <w:sz w:val="18"/>
-              </w:rPr>
-              <w:t>Rows without a reference are quarantined</w:t>
+            <w:tcW w:w="5000" w:type="dxa"/>
+            <w:shd w:val="clear" w:color="auto" w:fill="F2F6FC"/>
+          </w:tcPr>
+          <w:p>
+            <w:pPr>
+              <w:spacing w:after="0"/>
+              <w:rPr>
+                <w:sz w:val="18"/>
+              </w:rPr>
+            </w:pPr>
+            <w:r>
+              <w:rPr>
+                <w:sz w:val="18"/>
+              </w:rPr>
+              <w:t>test_exact_duplicates_in_file_are_removed_and_audited</w:t>
+            </w:r>
+          </w:p>
+        </w:tc>
+        <w:tc>
+          <w:tcPr>
+            <w:tcW w:w="4620" w:type="dxa"/>
+            <w:shd w:val="clear" w:color="auto" w:fill="F2F6FC"/>
+          </w:tcPr>
+          <w:p>
+            <w:pPr>
+              <w:spacing w:after="0"/>
+              <w:rPr>
+                <w:sz w:val="18"/>
+              </w:rPr>
+            </w:pPr>
+            <w:r>
+              <w:rPr>
+                <w:sz w:val="18"/>
+              </w:rPr>
+              <w:t>Identical rows are removed, counted and traced to the surviving row</w:t>
             </w:r>
           </w:p>
         </w:tc>
@@ -12445,45 +12607,46 @@
         </w:trPr>
         <w:tc>
           <w:tcPr>
-            <w:tcW w:w="3800" w:type="dxa"/>
-            <w:tcBorders>
-              <w:bottom w:val="single" w:sz="4" w:space="0" w:color="BFBFBF"/>
-            </w:tcBorders>
-          </w:tcPr>
-          <w:p>
-            <w:pPr>
-              <w:spacing w:after="0"/>
-              <w:rPr>
-                <w:sz w:val="18"/>
-              </w:rPr>
-            </w:pPr>
-            <w:r>
-              <w:rPr>
-                <w:sz w:val="18"/>
-              </w:rPr>
-              <w:t>test_multiple_reasons</w:t>
-            </w:r>
-          </w:p>
-        </w:tc>
-        <w:tc>
-          <w:tcPr>
-            <w:tcW w:w="5820" w:type="dxa"/>
-            <w:tcBorders>
-              <w:bottom w:val="single" w:sz="4" w:space="0" w:color="BFBFBF"/>
-            </w:tcBorders>
-          </w:tcPr>
-          <w:p>
-            <w:pPr>
-              <w:spacing w:after="0"/>
-              <w:rPr>
-                <w:sz w:val="18"/>
-              </w:rPr>
-            </w:pPr>
-            <w:r>
-              <w:rPr>
-                <w:sz w:val="18"/>
-              </w:rPr>
-              <w:t>A row failing several rules lists every reason</w:t>
+            <w:tcW w:w="5000" w:type="dxa"/>
+            <w:tcBorders>
+              <w:bottom w:val="single" w:sz="4" w:space="0" w:color="BFBFBF"/>
+            </w:tcBorders>
+          </w:tcPr>
+          <w:p>
+            <w:pPr>
+              <w:spacing w:after="0"/>
+              <w:rPr>
+                <w:sz w:val="18"/>
+              </w:rPr>
+            </w:pPr>
+            <w:r>
+              <w:rPr>
+                <w:sz w:val="18"/>
+              </w:rPr>
+              <w:lastRenderedPageBreak/>
+              <w:t>test_genuine_repeats_with_different_ref_no_are_kept</w:t>
+            </w:r>
+          </w:p>
+        </w:tc>
+        <w:tc>
+          <w:tcPr>
+            <w:tcW w:w="4620" w:type="dxa"/>
+            <w:tcBorders>
+              <w:bottom w:val="single" w:sz="4" w:space="0" w:color="BFBFBF"/>
+            </w:tcBorders>
+          </w:tcPr>
+          <w:p>
+            <w:pPr>
+              <w:spacing w:after="0"/>
+              <w:rPr>
+                <w:sz w:val="18"/>
+              </w:rPr>
+            </w:pPr>
+            <w:r>
+              <w:rPr>
+                <w:sz w:val="18"/>
+              </w:rPr>
+              <w:t>Same values with different ref_no are all kept</w:t>
             </w:r>
           </w:p>
         </w:tc>
@@ -12494,41 +12657,41 @@
         </w:trPr>
         <w:tc>
           <w:tcPr>
-            <w:tcW w:w="3800" w:type="dxa"/>
-            <w:shd w:val="clear" w:color="auto" w:fill="F2F6FC"/>
-          </w:tcPr>
-          <w:p>
-            <w:pPr>
-              <w:spacing w:after="0"/>
-              <w:rPr>
-                <w:sz w:val="18"/>
-              </w:rPr>
-            </w:pPr>
-            <w:r>
-              <w:rPr>
-                <w:sz w:val="18"/>
-              </w:rPr>
-              <w:t>test_rerun_idempotent</w:t>
-            </w:r>
-          </w:p>
-        </w:tc>
-        <w:tc>
-          <w:tcPr>
-            <w:tcW w:w="5820" w:type="dxa"/>
-            <w:shd w:val="clear" w:color="auto" w:fill="F2F6FC"/>
-          </w:tcPr>
-          <w:p>
-            <w:pPr>
-              <w:spacing w:after="0"/>
-              <w:rPr>
-                <w:sz w:val="18"/>
-              </w:rPr>
-            </w:pPr>
-            <w:r>
-              <w:rPr>
-                <w:sz w:val="18"/>
-              </w:rPr>
-              <w:t>Second run skips files and outputs are byte-identical</w:t>
+            <w:tcW w:w="5000" w:type="dxa"/>
+            <w:shd w:val="clear" w:color="auto" w:fill="F2F6FC"/>
+          </w:tcPr>
+          <w:p>
+            <w:pPr>
+              <w:spacing w:after="0"/>
+              <w:rPr>
+                <w:sz w:val="18"/>
+              </w:rPr>
+            </w:pPr>
+            <w:r>
+              <w:rPr>
+                <w:sz w:val="18"/>
+              </w:rPr>
+              <w:t>test_key_conflict_is_quarantined_not_overwritten</w:t>
+            </w:r>
+          </w:p>
+        </w:tc>
+        <w:tc>
+          <w:tcPr>
+            <w:tcW w:w="4620" w:type="dxa"/>
+            <w:shd w:val="clear" w:color="auto" w:fill="F2F6FC"/>
+          </w:tcPr>
+          <w:p>
+            <w:pPr>
+              <w:spacing w:after="0"/>
+              <w:rPr>
+                <w:sz w:val="18"/>
+              </w:rPr>
+            </w:pPr>
+            <w:r>
+              <w:rPr>
+                <w:sz w:val="18"/>
+              </w:rPr>
+              <w:t>Same key with different values is quarantined; the loaded row is unchanged</w:t>
             </w:r>
           </w:p>
         </w:tc>
@@ -12539,45 +12702,45 @@
         </w:trPr>
         <w:tc>
           <w:tcPr>
-            <w:tcW w:w="3800" w:type="dxa"/>
-            <w:tcBorders>
-              <w:bottom w:val="single" w:sz="4" w:space="0" w:color="BFBFBF"/>
-            </w:tcBorders>
-          </w:tcPr>
-          <w:p>
-            <w:pPr>
-              <w:spacing w:after="0"/>
-              <w:rPr>
-                <w:sz w:val="18"/>
-              </w:rPr>
-            </w:pPr>
-            <w:r>
-              <w:rPr>
-                <w:sz w:val="18"/>
-              </w:rPr>
-              <w:t>test_force_reprocess_idempotent</w:t>
-            </w:r>
-          </w:p>
-        </w:tc>
-        <w:tc>
-          <w:tcPr>
-            <w:tcW w:w="5820" w:type="dxa"/>
-            <w:tcBorders>
-              <w:bottom w:val="single" w:sz="4" w:space="0" w:color="BFBFBF"/>
-            </w:tcBorders>
-          </w:tcPr>
-          <w:p>
-            <w:pPr>
-              <w:spacing w:after="0"/>
-              <w:rPr>
-                <w:sz w:val="18"/>
-              </w:rPr>
-            </w:pPr>
-            <w:r>
-              <w:rPr>
-                <w:sz w:val="18"/>
-              </w:rPr>
-              <w:t>Forced re-run changes nothing</w:t>
+            <w:tcW w:w="5000" w:type="dxa"/>
+            <w:tcBorders>
+              <w:bottom w:val="single" w:sz="4" w:space="0" w:color="BFBFBF"/>
+            </w:tcBorders>
+          </w:tcPr>
+          <w:p>
+            <w:pPr>
+              <w:spacing w:after="0"/>
+              <w:rPr>
+                <w:sz w:val="18"/>
+              </w:rPr>
+            </w:pPr>
+            <w:r>
+              <w:rPr>
+                <w:sz w:val="18"/>
+              </w:rPr>
+              <w:t>test_formatting_differences_are_still_duplicates</w:t>
+            </w:r>
+          </w:p>
+        </w:tc>
+        <w:tc>
+          <w:tcPr>
+            <w:tcW w:w="4620" w:type="dxa"/>
+            <w:tcBorders>
+              <w:bottom w:val="single" w:sz="4" w:space="0" w:color="BFBFBF"/>
+            </w:tcBorders>
+          </w:tcPr>
+          <w:p>
+            <w:pPr>
+              <w:spacing w:after="0"/>
+              <w:rPr>
+                <w:sz w:val="18"/>
+              </w:rPr>
+            </w:pPr>
+            <w:r>
+              <w:rPr>
+                <w:sz w:val="18"/>
+              </w:rPr>
+              <w:t>100 vs 100.00 and savings vs SAVINGS are still duplicates</w:t>
             </w:r>
           </w:p>
         </w:tc>
@@ -12588,41 +12751,41 @@
         </w:trPr>
         <w:tc>
           <w:tcPr>
-            <w:tcW w:w="3800" w:type="dxa"/>
-            <w:shd w:val="clear" w:color="auto" w:fill="F2F6FC"/>
-          </w:tcPr>
-          <w:p>
-            <w:pPr>
-              <w:spacing w:after="0"/>
-              <w:rPr>
-                <w:sz w:val="18"/>
-              </w:rPr>
-            </w:pPr>
-            <w:r>
-              <w:rPr>
-                <w:sz w:val="18"/>
-              </w:rPr>
-              <w:t>test_late_rows_to_history</w:t>
-            </w:r>
-          </w:p>
-        </w:tc>
-        <w:tc>
-          <w:tcPr>
-            <w:tcW w:w="5820" w:type="dxa"/>
-            <w:shd w:val="clear" w:color="auto" w:fill="F2F6FC"/>
-          </w:tcPr>
-          <w:p>
-            <w:pPr>
-              <w:spacing w:after="0"/>
-              <w:rPr>
-                <w:sz w:val="18"/>
-              </w:rPr>
-            </w:pPr>
-            <w:r>
-              <w:rPr>
-                <w:sz w:val="18"/>
-              </w:rPr>
-              <w:t>Late rows land in their txn_date partition</w:t>
+            <w:tcW w:w="5000" w:type="dxa"/>
+            <w:shd w:val="clear" w:color="auto" w:fill="F2F6FC"/>
+          </w:tcPr>
+          <w:p>
+            <w:pPr>
+              <w:spacing w:after="0"/>
+              <w:rPr>
+                <w:sz w:val="18"/>
+              </w:rPr>
+            </w:pPr>
+            <w:r>
+              <w:rPr>
+                <w:sz w:val="18"/>
+              </w:rPr>
+              <w:t>test_rerun_skips_files_and_changes_nothing</w:t>
+            </w:r>
+          </w:p>
+        </w:tc>
+        <w:tc>
+          <w:tcPr>
+            <w:tcW w:w="4620" w:type="dxa"/>
+            <w:shd w:val="clear" w:color="auto" w:fill="F2F6FC"/>
+          </w:tcPr>
+          <w:p>
+            <w:pPr>
+              <w:spacing w:after="0"/>
+              <w:rPr>
+                <w:sz w:val="18"/>
+              </w:rPr>
+            </w:pPr>
+            <w:r>
+              <w:rPr>
+                <w:sz w:val="18"/>
+              </w:rPr>
+              <w:t>Second run skips files and all outputs are byte-identical</w:t>
             </w:r>
           </w:p>
         </w:tc>
@@ -12633,45 +12796,45 @@
         </w:trPr>
         <w:tc>
           <w:tcPr>
-            <w:tcW w:w="3800" w:type="dxa"/>
-            <w:tcBorders>
-              <w:bottom w:val="single" w:sz="4" w:space="0" w:color="BFBFBF"/>
-            </w:tcBorders>
-          </w:tcPr>
-          <w:p>
-            <w:pPr>
-              <w:spacing w:after="0"/>
-              <w:rPr>
-                <w:sz w:val="18"/>
-              </w:rPr>
-            </w:pPr>
-            <w:r>
-              <w:rPr>
-                <w:sz w:val="18"/>
-              </w:rPr>
-              <w:t>test_late_rows_not_duplicated</w:t>
-            </w:r>
-          </w:p>
-        </w:tc>
-        <w:tc>
-          <w:tcPr>
-            <w:tcW w:w="5820" w:type="dxa"/>
-            <w:tcBorders>
-              <w:bottom w:val="single" w:sz="4" w:space="0" w:color="BFBFBF"/>
-            </w:tcBorders>
-          </w:tcPr>
-          <w:p>
-            <w:pPr>
-              <w:spacing w:after="0"/>
-              <w:rPr>
-                <w:sz w:val="18"/>
-              </w:rPr>
-            </w:pPr>
-            <w:r>
-              <w:rPr>
-                <w:sz w:val="18"/>
-              </w:rPr>
-              <w:t>Re-running the late file adds nothing</w:t>
+            <w:tcW w:w="5000" w:type="dxa"/>
+            <w:tcBorders>
+              <w:bottom w:val="single" w:sz="4" w:space="0" w:color="BFBFBF"/>
+            </w:tcBorders>
+          </w:tcPr>
+          <w:p>
+            <w:pPr>
+              <w:spacing w:after="0"/>
+              <w:rPr>
+                <w:sz w:val="18"/>
+              </w:rPr>
+            </w:pPr>
+            <w:r>
+              <w:rPr>
+                <w:sz w:val="18"/>
+              </w:rPr>
+              <w:t>test_force_reprocess_produces_identical_outputs</w:t>
+            </w:r>
+          </w:p>
+        </w:tc>
+        <w:tc>
+          <w:tcPr>
+            <w:tcW w:w="4620" w:type="dxa"/>
+            <w:tcBorders>
+              <w:bottom w:val="single" w:sz="4" w:space="0" w:color="BFBFBF"/>
+            </w:tcBorders>
+          </w:tcPr>
+          <w:p>
+            <w:pPr>
+              <w:spacing w:after="0"/>
+              <w:rPr>
+                <w:sz w:val="18"/>
+              </w:rPr>
+            </w:pPr>
+            <w:r>
+              <w:rPr>
+                <w:sz w:val="18"/>
+              </w:rPr>
+              <w:t>Forced re-run changes nothing</w:t>
             </w:r>
           </w:p>
         </w:tc>
@@ -12682,41 +12845,41 @@
         </w:trPr>
         <w:tc>
           <w:tcPr>
-            <w:tcW w:w="3800" w:type="dxa"/>
-            <w:shd w:val="clear" w:color="auto" w:fill="F2F6FC"/>
-          </w:tcPr>
-          <w:p>
-            <w:pPr>
-              <w:spacing w:after="0"/>
-              <w:rPr>
-                <w:sz w:val="18"/>
-              </w:rPr>
-            </w:pPr>
-            <w:r>
-              <w:rPr>
-                <w:sz w:val="18"/>
-              </w:rPr>
-              <w:t>test_reconciliation_balances</w:t>
-            </w:r>
-          </w:p>
-        </w:tc>
-        <w:tc>
-          <w:tcPr>
-            <w:tcW w:w="5820" w:type="dxa"/>
-            <w:shd w:val="clear" w:color="auto" w:fill="F2F6FC"/>
-          </w:tcPr>
-          <w:p>
-            <w:pPr>
-              <w:spacing w:after="0"/>
-              <w:rPr>
-                <w:sz w:val="18"/>
-              </w:rPr>
-            </w:pPr>
-            <w:r>
-              <w:rPr>
-                <w:sz w:val="18"/>
-              </w:rPr>
-              <w:t>received = processed + rejected + duplicates</w:t>
+            <w:tcW w:w="5000" w:type="dxa"/>
+            <w:shd w:val="clear" w:color="auto" w:fill="F2F6FC"/>
+          </w:tcPr>
+          <w:p>
+            <w:pPr>
+              <w:spacing w:after="0"/>
+              <w:rPr>
+                <w:sz w:val="18"/>
+              </w:rPr>
+            </w:pPr>
+            <w:r>
+              <w:rPr>
+                <w:sz w:val="18"/>
+              </w:rPr>
+              <w:t>test_lost_manifest_does_not_create_duplicates</w:t>
+            </w:r>
+          </w:p>
+        </w:tc>
+        <w:tc>
+          <w:tcPr>
+            <w:tcW w:w="4620" w:type="dxa"/>
+            <w:shd w:val="clear" w:color="auto" w:fill="F2F6FC"/>
+          </w:tcPr>
+          <w:p>
+            <w:pPr>
+              <w:spacing w:after="0"/>
+              <w:rPr>
+                <w:sz w:val="18"/>
+              </w:rPr>
+            </w:pPr>
+            <w:r>
+              <w:rPr>
+                <w:sz w:val="18"/>
+              </w:rPr>
+              <w:t>Record-level idempotency works even without the manifest</w:t>
             </w:r>
           </w:p>
         </w:tc>
@@ -12727,45 +12890,45 @@
         </w:trPr>
         <w:tc>
           <w:tcPr>
-            <w:tcW w:w="3800" w:type="dxa"/>
-            <w:tcBorders>
-              <w:bottom w:val="single" w:sz="4" w:space="0" w:color="BFBFBF"/>
-            </w:tcBorders>
-          </w:tcPr>
-          <w:p>
-            <w:pPr>
-              <w:spacing w:after="0"/>
-              <w:rPr>
-                <w:sz w:val="18"/>
-              </w:rPr>
-            </w:pPr>
-            <w:r>
-              <w:rPr>
-                <w:sz w:val="18"/>
-              </w:rPr>
-              <w:t>test_missing_file_detected</w:t>
-            </w:r>
-          </w:p>
-        </w:tc>
-        <w:tc>
-          <w:tcPr>
-            <w:tcW w:w="5820" w:type="dxa"/>
-            <w:tcBorders>
-              <w:bottom w:val="single" w:sz="4" w:space="0" w:color="BFBFBF"/>
-            </w:tcBorders>
-          </w:tcPr>
-          <w:p>
-            <w:pPr>
-              <w:spacing w:after="0"/>
-              <w:rPr>
-                <w:sz w:val="18"/>
-              </w:rPr>
-            </w:pPr>
-            <w:r>
-              <w:rPr>
-                <w:sz w:val="18"/>
-              </w:rPr>
-              <w:t>Calendar gaps are reported</w:t>
+            <w:tcW w:w="5000" w:type="dxa"/>
+            <w:tcBorders>
+              <w:bottom w:val="single" w:sz="4" w:space="0" w:color="BFBFBF"/>
+            </w:tcBorders>
+          </w:tcPr>
+          <w:p>
+            <w:pPr>
+              <w:spacing w:after="0"/>
+              <w:rPr>
+                <w:sz w:val="18"/>
+              </w:rPr>
+            </w:pPr>
+            <w:r>
+              <w:rPr>
+                <w:sz w:val="18"/>
+              </w:rPr>
+              <w:t>test_restated_file_only_adds_new_rows</w:t>
+            </w:r>
+          </w:p>
+        </w:tc>
+        <w:tc>
+          <w:tcPr>
+            <w:tcW w:w="4620" w:type="dxa"/>
+            <w:tcBorders>
+              <w:bottom w:val="single" w:sz="4" w:space="0" w:color="BFBFBF"/>
+            </w:tcBorders>
+          </w:tcPr>
+          <w:p>
+            <w:pPr>
+              <w:spacing w:after="0"/>
+              <w:rPr>
+                <w:sz w:val="18"/>
+              </w:rPr>
+            </w:pPr>
+            <w:r>
+              <w:rPr>
+                <w:sz w:val="18"/>
+              </w:rPr>
+              <w:t>A re-delivered file with new content adds only the new rows</w:t>
             </w:r>
           </w:p>
         </w:tc>
@@ -12776,41 +12939,41 @@
         </w:trPr>
         <w:tc>
           <w:tcPr>
-            <w:tcW w:w="3800" w:type="dxa"/>
-            <w:shd w:val="clear" w:color="auto" w:fill="F2F6FC"/>
-          </w:tcPr>
-          <w:p>
-            <w:pPr>
-              <w:spacing w:after="0"/>
-              <w:rPr>
-                <w:sz w:val="18"/>
-              </w:rPr>
-            </w:pPr>
-            <w:r>
-              <w:rPr>
-                <w:sz w:val="18"/>
-              </w:rPr>
-              <w:t>test_schema_drift_rejects_file</w:t>
-            </w:r>
-          </w:p>
-        </w:tc>
-        <w:tc>
-          <w:tcPr>
-            <w:tcW w:w="5820" w:type="dxa"/>
-            <w:shd w:val="clear" w:color="auto" w:fill="F2F6FC"/>
-          </w:tcPr>
-          <w:p>
-            <w:pPr>
-              <w:spacing w:after="0"/>
-              <w:rPr>
-                <w:sz w:val="18"/>
-              </w:rPr>
-            </w:pPr>
-            <w:r>
-              <w:rPr>
-                <w:sz w:val="18"/>
-              </w:rPr>
-              <w:t>An unexpected header fails the whole file</w:t>
+            <w:tcW w:w="5000" w:type="dxa"/>
+            <w:shd w:val="clear" w:color="auto" w:fill="F2F6FC"/>
+          </w:tcPr>
+          <w:p>
+            <w:pPr>
+              <w:spacing w:after="0"/>
+              <w:rPr>
+                <w:sz w:val="18"/>
+              </w:rPr>
+            </w:pPr>
+            <w:r>
+              <w:rPr>
+                <w:sz w:val="18"/>
+              </w:rPr>
+              <w:t>test_late_file_in_a_later_run_lands_in_history_once</w:t>
+            </w:r>
+          </w:p>
+        </w:tc>
+        <w:tc>
+          <w:tcPr>
+            <w:tcW w:w="4620" w:type="dxa"/>
+            <w:shd w:val="clear" w:color="auto" w:fill="F2F6FC"/>
+          </w:tcPr>
+          <w:p>
+            <w:pPr>
+              <w:spacing w:after="0"/>
+              <w:rPr>
+                <w:sz w:val="18"/>
+              </w:rPr>
+            </w:pPr>
+            <w:r>
+              <w:rPr>
+                <w:sz w:val="18"/>
+              </w:rPr>
+              <w:t>Late rows land in their txn_date partition, once</w:t>
             </w:r>
           </w:p>
         </w:tc>
@@ -12821,39 +12984,133 @@
         </w:trPr>
         <w:tc>
           <w:tcPr>
-            <w:tcW w:w="3800" w:type="dxa"/>
-          </w:tcPr>
-          <w:p>
-            <w:pPr>
-              <w:spacing w:after="0"/>
-              <w:rPr>
-                <w:sz w:val="18"/>
-              </w:rPr>
-            </w:pPr>
-            <w:r>
-              <w:rPr>
-                <w:sz w:val="18"/>
-              </w:rPr>
-              <w:t>test_end_to_end_real_files</w:t>
-            </w:r>
-          </w:p>
-        </w:tc>
-        <w:tc>
-          <w:tcPr>
-            <w:tcW w:w="5820" w:type="dxa"/>
-          </w:tcPr>
-          <w:p>
-            <w:pPr>
-              <w:spacing w:after="0"/>
-              <w:rPr>
-                <w:sz w:val="18"/>
-              </w:rPr>
-            </w:pPr>
-            <w:r>
-              <w:rPr>
-                <w:sz w:val="18"/>
-              </w:rPr>
-              <w:t>190 / 183 / 3 / 4 on the provided data</w:t>
+            <w:tcW w:w="5000" w:type="dxa"/>
+            <w:tcBorders>
+              <w:bottom w:val="single" w:sz="4" w:space="0" w:color="BFBFBF"/>
+            </w:tcBorders>
+          </w:tcPr>
+          <w:p>
+            <w:pPr>
+              <w:spacing w:after="0"/>
+              <w:rPr>
+                <w:sz w:val="18"/>
+              </w:rPr>
+            </w:pPr>
+            <w:r>
+              <w:rPr>
+                <w:sz w:val="18"/>
+              </w:rPr>
+              <w:t>test_schema_drift_fails_only_that_file</w:t>
+            </w:r>
+          </w:p>
+        </w:tc>
+        <w:tc>
+          <w:tcPr>
+            <w:tcW w:w="4620" w:type="dxa"/>
+            <w:tcBorders>
+              <w:bottom w:val="single" w:sz="4" w:space="0" w:color="BFBFBF"/>
+            </w:tcBorders>
+          </w:tcPr>
+          <w:p>
+            <w:pPr>
+              <w:spacing w:after="0"/>
+              <w:rPr>
+                <w:sz w:val="18"/>
+              </w:rPr>
+            </w:pPr>
+            <w:r>
+              <w:rPr>
+                <w:sz w:val="18"/>
+              </w:rPr>
+              <w:t>An unexpected header fails that file only</w:t>
+            </w:r>
+          </w:p>
+        </w:tc>
+      </w:tr>
+      <w:tr>
+        <w:trPr>
+          <w:cantSplit/>
+        </w:trPr>
+        <w:tc>
+          <w:tcPr>
+            <w:tcW w:w="5000" w:type="dxa"/>
+            <w:shd w:val="clear" w:color="auto" w:fill="F2F6FC"/>
+          </w:tcPr>
+          <w:p>
+            <w:pPr>
+              <w:spacing w:after="0"/>
+              <w:rPr>
+                <w:sz w:val="18"/>
+              </w:rPr>
+            </w:pPr>
+            <w:r>
+              <w:rPr>
+                <w:sz w:val="18"/>
+              </w:rPr>
+              <w:t>test_missing_dates_follow_business_calendar</w:t>
+            </w:r>
+          </w:p>
+        </w:tc>
+        <w:tc>
+          <w:tcPr>
+            <w:tcW w:w="4620" w:type="dxa"/>
+            <w:shd w:val="clear" w:color="auto" w:fill="F2F6FC"/>
+          </w:tcPr>
+          <w:p>
+            <w:pPr>
+              <w:spacing w:after="0"/>
+              <w:rPr>
+                <w:sz w:val="18"/>
+              </w:rPr>
+            </w:pPr>
+            <w:r>
+              <w:rPr>
+                <w:sz w:val="18"/>
+              </w:rPr>
+              <w:t>Calendar gaps are reported according to the configured calendar</w:t>
+            </w:r>
+          </w:p>
+        </w:tc>
+      </w:tr>
+      <w:tr>
+        <w:trPr>
+          <w:cantSplit/>
+        </w:trPr>
+        <w:tc>
+          <w:tcPr>
+            <w:tcW w:w="5000" w:type="dxa"/>
+          </w:tcPr>
+          <w:p>
+            <w:pPr>
+              <w:spacing w:after="0"/>
+              <w:rPr>
+                <w:sz w:val="18"/>
+              </w:rPr>
+            </w:pPr>
+            <w:r>
+              <w:rPr>
+                <w:sz w:val="18"/>
+              </w:rPr>
+              <w:t>test_end_to_end_on_provided_files</w:t>
+            </w:r>
+          </w:p>
+        </w:tc>
+        <w:tc>
+          <w:tcPr>
+            <w:tcW w:w="4620" w:type="dxa"/>
+          </w:tcPr>
+          <w:p>
+            <w:pPr>
+              <w:spacing w:after="0"/>
+              <w:rPr>
+                <w:sz w:val="18"/>
+              </w:rPr>
+            </w:pPr>
+            <w:r>
+              <w:rPr>
+                <w:sz w:val="18"/>
+              </w:rPr>
+              <w:t>190 / 183 / 3 / 4, reasons, late impact and warnings on the provided data</w:t>
             </w:r>
           </w:p>
         </w:tc>
@@ -12863,9 +13120,8 @@
       <w:pPr>
         <w:pStyle w:val="Heading1"/>
       </w:pPr>
-      <w:bookmarkStart w:id="28" w:name="_Toc242538900"/>
-      <w:r>
-        <w:lastRenderedPageBreak/>
+      <w:bookmarkStart w:id="28" w:name="_Toc242542001"/>
+      <w:r>
         <w:t>11. Project Structure</w:t>
       </w:r>
       <w:bookmarkEnd w:id="28"/>
@@ -12950,7 +13206,7 @@
                 <w:sz w:val="17"/>
               </w:rPr>
               <w:br/>
-              <w:t>|   |-- config.py  ingest.py  reader.py  validate.py</w:t>
+              <w:t>|   |-- config.py  ingest.py  manifest.py  reader.py  validate.py</w:t>
             </w:r>
             <w:r>
               <w:rPr>
@@ -13032,7 +13288,7 @@
       <w:pPr>
         <w:pStyle w:val="Heading2"/>
       </w:pPr>
-      <w:bookmarkStart w:id="29" w:name="_Toc242538901"/>
+      <w:bookmarkStart w:id="29" w:name="_Toc242542002"/>
       <w:r>
         <w:t>11.1 How It Will Be Run</w:t>
       </w:r>
@@ -13128,7 +13384,7 @@
       <w:pPr>
         <w:pStyle w:val="Heading1"/>
       </w:pPr>
-      <w:bookmarkStart w:id="30" w:name="_Toc242538902"/>
+      <w:bookmarkStart w:id="30" w:name="_Toc242542003"/>
       <w:r>
         <w:t>12. Assumptions</w:t>
       </w:r>
@@ -13137,6 +13393,10 @@
     <w:p>
       <w:pPr>
         <w:pStyle w:val="ListNumber"/>
+        <w:numPr>
+          <w:ilvl w:val="0"/>
+          <w:numId w:val="4"/>
+        </w:numPr>
       </w:pPr>
       <w:r>
         <w:rPr>
@@ -13151,6 +13411,10 @@
     <w:p>
       <w:pPr>
         <w:pStyle w:val="ListNumber"/>
+        <w:numPr>
+          <w:ilvl w:val="0"/>
+          <w:numId w:val="4"/>
+        </w:numPr>
       </w:pPr>
       <w:r>
         <w:rPr>
@@ -13165,6 +13429,10 @@
     <w:p>
       <w:pPr>
         <w:pStyle w:val="ListNumber"/>
+        <w:numPr>
+          <w:ilvl w:val="0"/>
+          <w:numId w:val="4"/>
+        </w:numPr>
       </w:pPr>
       <w:r>
         <w:rPr>
@@ -13179,6 +13447,10 @@
     <w:p>
       <w:pPr>
         <w:pStyle w:val="ListNumber"/>
+        <w:numPr>
+          <w:ilvl w:val="0"/>
+          <w:numId w:val="4"/>
+        </w:numPr>
       </w:pPr>
       <w:r>
         <w:rPr>
@@ -13193,6 +13465,10 @@
     <w:p>
       <w:pPr>
         <w:pStyle w:val="ListNumber"/>
+        <w:numPr>
+          <w:ilvl w:val="0"/>
+          <w:numId w:val="4"/>
+        </w:numPr>
       </w:pPr>
       <w:r>
         <w:rPr>
@@ -13207,6 +13483,10 @@
     <w:p>
       <w:pPr>
         <w:pStyle w:val="ListNumber"/>
+        <w:numPr>
+          <w:ilvl w:val="0"/>
+          <w:numId w:val="4"/>
+        </w:numPr>
       </w:pPr>
       <w:r>
         <w:rPr>
@@ -13221,20 +13501,29 @@
     <w:p>
       <w:pPr>
         <w:pStyle w:val="ListNumber"/>
+        <w:numPr>
+          <w:ilvl w:val="0"/>
+          <w:numId w:val="4"/>
+        </w:numPr>
       </w:pPr>
       <w:r>
         <w:rPr>
           <w:b/>
         </w:rPr>
+        <w:lastRenderedPageBreak/>
         <w:t>Late corrections add, not replace:</w:t>
       </w:r>
       <w:r>
-        <w:t xml:space="preserve"> the correction file contains additional transactions for an earlier date. It does not delete existing rows. A key that already exists with different values is quarantined for review, not overwritten (configurable to latest-wins).</w:t>
+        <w:t xml:space="preserve"> the correction file contains additional transactions for an earlier date. It does not delete existing rows. A key that already exists with different values is quarantined for review, not overwritten.</w:t>
       </w:r>
     </w:p>
     <w:p>
       <w:pPr>
         <w:pStyle w:val="ListNumber"/>
+        <w:numPr>
+          <w:ilvl w:val="0"/>
+          <w:numId w:val="4"/>
+        </w:numPr>
       </w:pPr>
       <w:r>
         <w:rPr>
@@ -13249,6 +13538,10 @@
     <w:p>
       <w:pPr>
         <w:pStyle w:val="ListNumber"/>
+        <w:numPr>
+          <w:ilvl w:val="0"/>
+          <w:numId w:val="4"/>
+        </w:numPr>
       </w:pPr>
       <w:r>
         <w:rPr>
@@ -13263,6 +13556,10 @@
     <w:p>
       <w:pPr>
         <w:pStyle w:val="ListNumber"/>
+        <w:numPr>
+          <w:ilvl w:val="0"/>
+          <w:numId w:val="4"/>
+        </w:numPr>
       </w:pPr>
       <w:r>
         <w:rPr>
@@ -13277,6 +13574,10 @@
     <w:p>
       <w:pPr>
         <w:pStyle w:val="ListNumber"/>
+        <w:numPr>
+          <w:ilvl w:val="0"/>
+          <w:numId w:val="4"/>
+        </w:numPr>
       </w:pPr>
       <w:r>
         <w:rPr>
@@ -13291,6 +13592,10 @@
     <w:p>
       <w:pPr>
         <w:pStyle w:val="ListNumber"/>
+        <w:numPr>
+          <w:ilvl w:val="0"/>
+          <w:numId w:val="4"/>
+        </w:numPr>
       </w:pPr>
       <w:r>
         <w:rPr>
@@ -13299,12 +13604,16 @@
         <w:t>Volume:</w:t>
       </w:r>
       <w:r>
-        <w:t xml:space="preserve"> data is small enough for single-machine Pandas processing.</w:t>
+        <w:t xml:space="preserve"> data is small enough for single-machine Pandas processing (Pandas 3.x is used).</w:t>
       </w:r>
     </w:p>
     <w:p>
       <w:pPr>
         <w:pStyle w:val="ListNumber"/>
+        <w:numPr>
+          <w:ilvl w:val="0"/>
+          <w:numId w:val="4"/>
+        </w:numPr>
       </w:pPr>
       <w:r>
         <w:rPr>
@@ -13319,6 +13628,10 @@
     <w:p>
       <w:pPr>
         <w:pStyle w:val="ListNumber"/>
+        <w:numPr>
+          <w:ilvl w:val="0"/>
+          <w:numId w:val="4"/>
+        </w:numPr>
       </w:pPr>
       <w:r>
         <w:rPr>
@@ -13334,7 +13647,7 @@
       <w:pPr>
         <w:pStyle w:val="Heading1"/>
       </w:pPr>
-      <w:bookmarkStart w:id="31" w:name="_Toc242538903"/>
+      <w:bookmarkStart w:id="31" w:name="_Toc242542004"/>
       <w:r>
         <w:t>13. Key Design Decisions and Trade-offs</w:t>
       </w:r>
@@ -13538,7 +13851,6 @@
                 <w:b/>
                 <w:sz w:val="18"/>
               </w:rPr>
-              <w:lastRenderedPageBreak/>
               <w:t>Quarantine key conflicts</w:t>
             </w:r>
           </w:p>
@@ -13579,7 +13891,7 @@
               <w:rPr>
                 <w:sz w:val="18"/>
               </w:rPr>
-              <w:t>Financial data should not change silently; reviewer decides. Configurable.</w:t>
+              <w:t>Financial data should not change silently; a reviewer decides</w:t>
             </w:r>
           </w:p>
         </w:tc>
@@ -13869,7 +14181,7 @@
       <w:pPr>
         <w:pStyle w:val="Heading1"/>
       </w:pPr>
-      <w:bookmarkStart w:id="32" w:name="_Toc242538904"/>
+      <w:bookmarkStart w:id="32" w:name="_Toc242542005"/>
       <w:r>
         <w:t>14. Future Enhancements</w:t>
       </w:r>
@@ -14125,7 +14437,7 @@
   <w:abstractNum w:abstractNumId="0" w15:restartNumberingAfterBreak="0">
     <w:nsid w:val="FFFFFF83"/>
     <w:multiLevelType w:val="singleLevel"/>
-    <w:tmpl w:val="0C0A1CDC"/>
+    <w:tmpl w:val="D906644C"/>
     <w:lvl w:ilvl="0">
       <w:start w:val="1"/>
       <w:numFmt w:val="bullet"/>
@@ -14146,7 +14458,7 @@
   <w:abstractNum w:abstractNumId="1" w15:restartNumberingAfterBreak="0">
     <w:nsid w:val="FFFFFF88"/>
     <w:multiLevelType w:val="singleLevel"/>
-    <w:tmpl w:val="473C18CE"/>
+    <w:tmpl w:val="C21A0884"/>
     <w:lvl w:ilvl="0">
       <w:start w:val="1"/>
       <w:numFmt w:val="decimal"/>
@@ -14164,7 +14476,7 @@
   <w:abstractNum w:abstractNumId="2" w15:restartNumberingAfterBreak="0">
     <w:nsid w:val="FFFFFF89"/>
     <w:multiLevelType w:val="singleLevel"/>
-    <w:tmpl w:val="8926F370"/>
+    <w:tmpl w:val="10F2906C"/>
     <w:lvl w:ilvl="0">
       <w:start w:val="1"/>
       <w:numFmt w:val="bullet"/>
@@ -14182,14 +14494,20 @@
       </w:rPr>
     </w:lvl>
   </w:abstractNum>
-  <w:num w:numId="1" w16cid:durableId="1807552484">
+  <w:num w:numId="1" w16cid:durableId="2046639488">
     <w:abstractNumId w:val="2"/>
   </w:num>
-  <w:num w:numId="2" w16cid:durableId="1294750118">
+  <w:num w:numId="2" w16cid:durableId="1172447459">
     <w:abstractNumId w:val="1"/>
   </w:num>
-  <w:num w:numId="3" w16cid:durableId="1223053870">
+  <w:num w:numId="3" w16cid:durableId="472143376">
     <w:abstractNumId w:val="0"/>
+  </w:num>
+  <w:num w:numId="4" w16cid:durableId="22097101">
+    <w:abstractNumId w:val="1"/>
+    <w:lvlOverride w:ilvl="0">
+      <w:startOverride w:val="1"/>
+    </w:lvlOverride>
   </w:num>
 </w:numbering>
 </file>
@@ -14609,7 +14927,7 @@
     <w:link w:val="Heading1Char"/>
     <w:uiPriority w:val="9"/>
     <w:qFormat/>
-    <w:rsid w:val="00492155"/>
+    <w:rsid w:val="003D3393"/>
     <w:pPr>
       <w:keepNext/>
       <w:keepLines/>
@@ -14632,7 +14950,7 @@
     <w:uiPriority w:val="9"/>
     <w:unhideWhenUsed/>
     <w:qFormat/>
-    <w:rsid w:val="00492155"/>
+    <w:rsid w:val="003D3393"/>
     <w:pPr>
       <w:keepNext/>
       <w:keepLines/>
@@ -14656,7 +14974,7 @@
     <w:semiHidden/>
     <w:unhideWhenUsed/>
     <w:qFormat/>
-    <w:rsid w:val="00492155"/>
+    <w:rsid w:val="003D3393"/>
     <w:pPr>
       <w:keepNext/>
       <w:keepLines/>
@@ -14680,7 +14998,7 @@
     <w:semiHidden/>
     <w:unhideWhenUsed/>
     <w:qFormat/>
-    <w:rsid w:val="00492155"/>
+    <w:rsid w:val="003D3393"/>
     <w:pPr>
       <w:keepNext/>
       <w:keepLines/>
@@ -14703,7 +15021,7 @@
     <w:semiHidden/>
     <w:unhideWhenUsed/>
     <w:qFormat/>
-    <w:rsid w:val="00492155"/>
+    <w:rsid w:val="003D3393"/>
     <w:pPr>
       <w:keepNext/>
       <w:keepLines/>
@@ -14724,7 +15042,7 @@
     <w:semiHidden/>
     <w:unhideWhenUsed/>
     <w:qFormat/>
-    <w:rsid w:val="00492155"/>
+    <w:rsid w:val="003D3393"/>
     <w:pPr>
       <w:keepNext/>
       <w:keepLines/>
@@ -14747,7 +15065,7 @@
     <w:semiHidden/>
     <w:unhideWhenUsed/>
     <w:qFormat/>
-    <w:rsid w:val="00492155"/>
+    <w:rsid w:val="003D3393"/>
     <w:pPr>
       <w:keepNext/>
       <w:keepLines/>
@@ -14768,7 +15086,7 @@
     <w:semiHidden/>
     <w:unhideWhenUsed/>
     <w:qFormat/>
-    <w:rsid w:val="00492155"/>
+    <w:rsid w:val="003D3393"/>
     <w:pPr>
       <w:keepNext/>
       <w:keepLines/>
@@ -14791,7 +15109,7 @@
     <w:semiHidden/>
     <w:unhideWhenUsed/>
     <w:qFormat/>
-    <w:rsid w:val="00492155"/>
+    <w:rsid w:val="003D3393"/>
     <w:pPr>
       <w:keepNext/>
       <w:keepLines/>
@@ -14835,7 +15153,7 @@
     <w:basedOn w:val="DefaultParagraphFont"/>
     <w:link w:val="Heading1"/>
     <w:uiPriority w:val="9"/>
-    <w:rsid w:val="00492155"/>
+    <w:rsid w:val="003D3393"/>
     <w:rPr>
       <w:rFonts w:ascii="Calibri" w:eastAsiaTheme="majorEastAsia" w:hAnsi="Calibri" w:cstheme="majorBidi"/>
       <w:b/>
@@ -14849,7 +15167,7 @@
     <w:basedOn w:val="DefaultParagraphFont"/>
     <w:link w:val="Heading2"/>
     <w:uiPriority w:val="9"/>
-    <w:rsid w:val="00492155"/>
+    <w:rsid w:val="003D3393"/>
     <w:rPr>
       <w:rFonts w:ascii="Calibri" w:eastAsiaTheme="majorEastAsia" w:hAnsi="Calibri" w:cstheme="majorBidi"/>
       <w:b/>
@@ -14864,7 +15182,7 @@
     <w:link w:val="Heading3"/>
     <w:uiPriority w:val="9"/>
     <w:semiHidden/>
-    <w:rsid w:val="00492155"/>
+    <w:rsid w:val="003D3393"/>
     <w:rPr>
       <w:rFonts w:ascii="Calibri" w:eastAsiaTheme="majorEastAsia" w:hAnsi="Calibri" w:cstheme="majorBidi"/>
       <w:b/>
@@ -14879,7 +15197,7 @@
     <w:link w:val="Heading4"/>
     <w:uiPriority w:val="9"/>
     <w:semiHidden/>
-    <w:rsid w:val="00492155"/>
+    <w:rsid w:val="003D3393"/>
     <w:rPr>
       <w:rFonts w:eastAsiaTheme="majorEastAsia" w:cstheme="majorBidi"/>
       <w:i/>
@@ -14893,7 +15211,7 @@
     <w:link w:val="Heading5"/>
     <w:uiPriority w:val="9"/>
     <w:semiHidden/>
-    <w:rsid w:val="00492155"/>
+    <w:rsid w:val="003D3393"/>
     <w:rPr>
       <w:rFonts w:eastAsiaTheme="majorEastAsia" w:cstheme="majorBidi"/>
       <w:color w:val="0F4761" w:themeColor="accent1" w:themeShade="BF"/>
@@ -14905,7 +15223,7 @@
     <w:link w:val="Heading6"/>
     <w:uiPriority w:val="9"/>
     <w:semiHidden/>
-    <w:rsid w:val="00492155"/>
+    <w:rsid w:val="003D3393"/>
     <w:rPr>
       <w:rFonts w:eastAsiaTheme="majorEastAsia" w:cstheme="majorBidi"/>
       <w:i/>
@@ -14919,7 +15237,7 @@
     <w:link w:val="Heading7"/>
     <w:uiPriority w:val="9"/>
     <w:semiHidden/>
-    <w:rsid w:val="00492155"/>
+    <w:rsid w:val="003D3393"/>
     <w:rPr>
       <w:rFonts w:eastAsiaTheme="majorEastAsia" w:cstheme="majorBidi"/>
       <w:color w:val="595959" w:themeColor="text1" w:themeTint="A6"/>
@@ -14931,7 +15249,7 @@
     <w:link w:val="Heading8"/>
     <w:uiPriority w:val="9"/>
     <w:semiHidden/>
-    <w:rsid w:val="00492155"/>
+    <w:rsid w:val="003D3393"/>
     <w:rPr>
       <w:rFonts w:eastAsiaTheme="majorEastAsia" w:cstheme="majorBidi"/>
       <w:i/>
@@ -14945,7 +15263,7 @@
     <w:link w:val="Heading9"/>
     <w:uiPriority w:val="9"/>
     <w:semiHidden/>
-    <w:rsid w:val="00492155"/>
+    <w:rsid w:val="003D3393"/>
     <w:rPr>
       <w:rFonts w:eastAsiaTheme="majorEastAsia" w:cstheme="majorBidi"/>
       <w:color w:val="272727" w:themeColor="text1" w:themeTint="D8"/>
@@ -14958,7 +15276,7 @@
     <w:link w:val="TitleChar"/>
     <w:uiPriority w:val="10"/>
     <w:qFormat/>
-    <w:rsid w:val="00492155"/>
+    <w:rsid w:val="003D3393"/>
     <w:pPr>
       <w:spacing w:after="80"/>
       <w:contextualSpacing/>
@@ -14976,7 +15294,7 @@
     <w:basedOn w:val="DefaultParagraphFont"/>
     <w:link w:val="Title"/>
     <w:uiPriority w:val="10"/>
-    <w:rsid w:val="00492155"/>
+    <w:rsid w:val="003D3393"/>
     <w:rPr>
       <w:rFonts w:asciiTheme="majorHAnsi" w:eastAsiaTheme="majorEastAsia" w:hAnsiTheme="majorHAnsi" w:cstheme="majorBidi"/>
       <w:spacing w:val="-10"/>
@@ -14992,7 +15310,7 @@
     <w:link w:val="SubtitleChar"/>
     <w:uiPriority w:val="11"/>
     <w:qFormat/>
-    <w:rsid w:val="00492155"/>
+    <w:rsid w:val="003D3393"/>
     <w:pPr>
       <w:numPr>
         <w:ilvl w:val="1"/>
@@ -15011,7 +15329,7 @@
     <w:basedOn w:val="DefaultParagraphFont"/>
     <w:link w:val="Subtitle"/>
     <w:uiPriority w:val="11"/>
-    <w:rsid w:val="00492155"/>
+    <w:rsid w:val="003D3393"/>
     <w:rPr>
       <w:rFonts w:eastAsiaTheme="majorEastAsia" w:cstheme="majorBidi"/>
       <w:color w:val="595959" w:themeColor="text1" w:themeTint="A6"/>
@@ -15027,7 +15345,7 @@
     <w:link w:val="QuoteChar"/>
     <w:uiPriority w:val="29"/>
     <w:qFormat/>
-    <w:rsid w:val="00492155"/>
+    <w:rsid w:val="003D3393"/>
     <w:pPr>
       <w:spacing w:before="160"/>
       <w:jc w:val="center"/>
@@ -15043,7 +15361,7 @@
     <w:basedOn w:val="DefaultParagraphFont"/>
     <w:link w:val="Quote"/>
     <w:uiPriority w:val="29"/>
-    <w:rsid w:val="00492155"/>
+    <w:rsid w:val="003D3393"/>
     <w:rPr>
       <w:i/>
       <w:iCs/>
@@ -15055,7 +15373,7 @@
     <w:basedOn w:val="Normal"/>
     <w:uiPriority w:val="34"/>
     <w:qFormat/>
-    <w:rsid w:val="00492155"/>
+    <w:rsid w:val="003D3393"/>
     <w:pPr>
       <w:ind w:left="720"/>
       <w:contextualSpacing/>
@@ -15066,7 +15384,7 @@
     <w:basedOn w:val="DefaultParagraphFont"/>
     <w:uiPriority w:val="21"/>
     <w:qFormat/>
-    <w:rsid w:val="00492155"/>
+    <w:rsid w:val="003D3393"/>
     <w:rPr>
       <w:i/>
       <w:iCs/>
@@ -15080,7 +15398,7 @@
     <w:link w:val="IntenseQuoteChar"/>
     <w:uiPriority w:val="30"/>
     <w:qFormat/>
-    <w:rsid w:val="00492155"/>
+    <w:rsid w:val="003D3393"/>
     <w:pPr>
       <w:pBdr>
         <w:top w:val="single" w:sz="4" w:space="10" w:color="0F4761" w:themeColor="accent1" w:themeShade="BF"/>
@@ -15101,7 +15419,7 @@
     <w:basedOn w:val="DefaultParagraphFont"/>
     <w:link w:val="IntenseQuote"/>
     <w:uiPriority w:val="30"/>
-    <w:rsid w:val="00492155"/>
+    <w:rsid w:val="003D3393"/>
     <w:rPr>
       <w:i/>
       <w:iCs/>
@@ -15113,7 +15431,7 @@
     <w:basedOn w:val="DefaultParagraphFont"/>
     <w:uiPriority w:val="32"/>
     <w:qFormat/>
-    <w:rsid w:val="00492155"/>
+    <w:rsid w:val="003D3393"/>
     <w:rPr>
       <w:b/>
       <w:bCs/>
@@ -15127,7 +15445,7 @@
     <w:basedOn w:val="Normal"/>
     <w:uiPriority w:val="99"/>
     <w:unhideWhenUsed/>
-    <w:rsid w:val="00492155"/>
+    <w:rsid w:val="003D3393"/>
     <w:pPr>
       <w:numPr>
         <w:numId w:val="1"/>
@@ -15141,7 +15459,7 @@
     <w:basedOn w:val="Normal"/>
     <w:uiPriority w:val="99"/>
     <w:unhideWhenUsed/>
-    <w:rsid w:val="00492155"/>
+    <w:rsid w:val="003D3393"/>
     <w:pPr>
       <w:numPr>
         <w:numId w:val="2"/>
@@ -15159,7 +15477,7 @@
     <w:uiPriority w:val="99"/>
     <w:semiHidden/>
     <w:unhideWhenUsed/>
-    <w:rsid w:val="00492155"/>
+    <w:rsid w:val="003D3393"/>
     <w:pPr>
       <w:numPr>
         <w:numId w:val="3"/>
@@ -15178,7 +15496,7 @@
     <w:uiPriority w:val="35"/>
     <w:unhideWhenUsed/>
     <w:qFormat/>
-    <w:rsid w:val="00492155"/>
+    <w:rsid w:val="003D3393"/>
     <w:pPr>
       <w:spacing w:after="200"/>
     </w:pPr>
@@ -15196,7 +15514,7 @@
     <w:link w:val="HeaderChar"/>
     <w:uiPriority w:val="99"/>
     <w:unhideWhenUsed/>
-    <w:rsid w:val="00492155"/>
+    <w:rsid w:val="003D3393"/>
     <w:pPr>
       <w:tabs>
         <w:tab w:val="center" w:pos="4513"/>
@@ -15210,7 +15528,7 @@
     <w:basedOn w:val="DefaultParagraphFont"/>
     <w:link w:val="Header"/>
     <w:uiPriority w:val="99"/>
-    <w:rsid w:val="00492155"/>
+    <w:rsid w:val="003D3393"/>
     <w:rPr>
       <w:rFonts w:ascii="Calibri" w:hAnsi="Calibri"/>
       <w:sz w:val="21"/>
@@ -15222,7 +15540,7 @@
     <w:link w:val="FooterChar"/>
     <w:uiPriority w:val="99"/>
     <w:unhideWhenUsed/>
-    <w:rsid w:val="00492155"/>
+    <w:rsid w:val="003D3393"/>
     <w:pPr>
       <w:tabs>
         <w:tab w:val="center" w:pos="4513"/>
@@ -15236,7 +15554,7 @@
     <w:basedOn w:val="DefaultParagraphFont"/>
     <w:link w:val="Footer"/>
     <w:uiPriority w:val="99"/>
-    <w:rsid w:val="00492155"/>
+    <w:rsid w:val="003D3393"/>
     <w:rPr>
       <w:rFonts w:ascii="Calibri" w:hAnsi="Calibri"/>
       <w:sz w:val="21"/>
@@ -15248,7 +15566,7 @@
     <w:uiPriority w:val="99"/>
     <w:semiHidden/>
     <w:unhideWhenUsed/>
-    <w:rsid w:val="00492155"/>
+    <w:rsid w:val="003D3393"/>
   </w:style>
   <w:style w:type="paragraph" w:styleId="TOC1">
     <w:name w:val="toc 1"/>
@@ -15257,7 +15575,7 @@
     <w:autoRedefine/>
     <w:uiPriority w:val="39"/>
     <w:unhideWhenUsed/>
-    <w:rsid w:val="00492155"/>
+    <w:rsid w:val="003D3393"/>
     <w:pPr>
       <w:spacing w:after="100"/>
     </w:pPr>
@@ -15269,7 +15587,7 @@
     <w:autoRedefine/>
     <w:uiPriority w:val="39"/>
     <w:unhideWhenUsed/>
-    <w:rsid w:val="00492155"/>
+    <w:rsid w:val="003D3393"/>
     <w:pPr>
       <w:spacing w:after="100"/>
       <w:ind w:left="210"/>

</xml_diff>